<commit_message>
Make CV text all black
Co-Authored-By: Claude Opus 5.5 <noreply@anthropic.com>
</commit_message>
<xml_diff>
--- a/assets/cv/CV.docx
+++ b/assets/cv/CV.docx
@@ -24,7 +24,7 @@
         <w:rPr>
           <w:b/>
           <w:bCs/>
-          <w:color w:val="0F4C81"/>
+          <w:color w:val="000000"/>
           <w:sz w:val="24"/>
           <w:szCs w:val="24"/>
         </w:rPr>
@@ -37,7 +37,7 @@
       </w:pPr>
       <w:r>
         <w:rPr>
-          <w:color w:val="555B63"/>
+          <w:color w:val="000000"/>
           <w:sz w:val="19"/>
           <w:szCs w:val="19"/>
         </w:rPr>
@@ -45,7 +45,7 @@
       </w:r>
       <w:r>
         <w:rPr>
-          <w:color w:val="C9D3DE"/>
+          <w:color w:val="000000"/>
           <w:sz w:val="19"/>
           <w:szCs w:val="19"/>
         </w:rPr>
@@ -53,7 +53,7 @@
       </w:r>
       <w:r>
         <w:rPr>
-          <w:color w:val="555B63"/>
+          <w:color w:val="000000"/>
           <w:sz w:val="19"/>
           <w:szCs w:val="19"/>
         </w:rPr>
@@ -61,16 +61,16 @@
       </w:r>
       <w:r>
         <w:rPr>
-          <w:color w:val="C9D3DE"/>
+          <w:color w:val="000000"/>
           <w:sz w:val="19"/>
           <w:szCs w:val="19"/>
         </w:rPr>
         <w:t xml:space="preserve">   ·   </w:t>
       </w:r>
-      <w:hyperlink w:history="1" r:id="rId6d2vmpsym-puzsrkwi3bc">
+      <w:hyperlink w:history="1" r:id="rIdg56d2dycx2b9zayejplht">
         <w:r>
           <w:rPr>
-            <w:color w:val="0F4C81"/>
+            <w:color w:val="000000"/>
             <w:sz w:val="19"/>
             <w:szCs w:val="19"/>
           </w:rPr>
@@ -84,16 +84,16 @@
       </w:pPr>
       <w:r>
         <w:rPr>
-          <w:color w:val="555B63"/>
+          <w:color w:val="000000"/>
           <w:sz w:val="19"/>
           <w:szCs w:val="19"/>
         </w:rPr>
         <w:t xml:space="preserve">Portfolio : </w:t>
       </w:r>
-      <w:hyperlink w:history="1" r:id="rIdtittegvjwjrajiixcthni">
+      <w:hyperlink w:history="1" r:id="rIdu-telilavkagcsr0syyt8">
         <w:r>
           <w:rPr>
-            <w:color w:val="0F4C81"/>
+            <w:color w:val="000000"/>
             <w:sz w:val="19"/>
             <w:szCs w:val="19"/>
           </w:rPr>
@@ -102,7 +102,7 @@
       </w:hyperlink>
       <w:r>
         <w:rPr>
-          <w:color w:val="C9D3DE"/>
+          <w:color w:val="000000"/>
           <w:sz w:val="19"/>
           <w:szCs w:val="19"/>
         </w:rPr>
@@ -110,16 +110,16 @@
       </w:r>
       <w:r>
         <w:rPr>
-          <w:color w:val="555B63"/>
+          <w:color w:val="000000"/>
           <w:sz w:val="19"/>
           <w:szCs w:val="19"/>
         </w:rPr>
         <w:t xml:space="preserve">GitHub : </w:t>
       </w:r>
-      <w:hyperlink w:history="1" r:id="rId2naxgephuxfcxhh5zwx2s">
+      <w:hyperlink w:history="1" r:id="rIdfa0eghj5rtowyojggnooz">
         <w:r>
           <w:rPr>
-            <w:color w:val="0F4C81"/>
+            <w:color w:val="000000"/>
             <w:sz w:val="19"/>
             <w:szCs w:val="19"/>
           </w:rPr>
@@ -128,7 +128,7 @@
       </w:hyperlink>
       <w:r>
         <w:rPr>
-          <w:color w:val="C9D3DE"/>
+          <w:color w:val="000000"/>
           <w:sz w:val="19"/>
           <w:szCs w:val="19"/>
         </w:rPr>
@@ -136,16 +136,16 @@
       </w:r>
       <w:r>
         <w:rPr>
-          <w:color w:val="555B63"/>
+          <w:color w:val="000000"/>
           <w:sz w:val="19"/>
           <w:szCs w:val="19"/>
         </w:rPr>
         <w:t xml:space="preserve">LinkedIn : </w:t>
       </w:r>
-      <w:hyperlink w:history="1" r:id="rId9sxazarm5caj2awbqfwoc">
+      <w:hyperlink w:history="1" r:id="rIdfnhlgio3-0zrubfpfwdmd">
         <w:r>
           <w:rPr>
-            <w:color w:val="0F4C81"/>
+            <w:color w:val="000000"/>
             <w:sz w:val="19"/>
             <w:szCs w:val="19"/>
           </w:rPr>
@@ -156,7 +156,7 @@
     <w:p>
       <w:pPr>
         <w:pBdr>
-          <w:bottom w:val="single" w:color="C9D3DE" w:sz="8" w:space="2"/>
+          <w:bottom w:val="single" w:color="B5B5B5" w:sz="8" w:space="2"/>
         </w:pBdr>
         <w:spacing w:after="80" w:before="220"/>
       </w:pPr>
@@ -164,7 +164,7 @@
         <w:rPr>
           <w:b/>
           <w:bCs/>
-          <w:color w:val="0F4C81"/>
+          <w:color w:val="000000"/>
           <w:spacing w:val="15"/>
           <w:sz w:val="21"/>
           <w:szCs w:val="21"/>
@@ -192,7 +192,7 @@
     <w:p>
       <w:pPr>
         <w:pBdr>
-          <w:bottom w:val="single" w:color="C9D3DE" w:sz="8" w:space="2"/>
+          <w:bottom w:val="single" w:color="B5B5B5" w:sz="8" w:space="2"/>
         </w:pBdr>
         <w:spacing w:after="80" w:before="220"/>
       </w:pPr>
@@ -200,7 +200,7 @@
         <w:rPr>
           <w:b/>
           <w:bCs/>
-          <w:color w:val="0F4C81"/>
+          <w:color w:val="000000"/>
           <w:spacing w:val="15"/>
           <w:sz w:val="21"/>
           <w:szCs w:val="21"/>
@@ -231,7 +231,7 @@
       </w:r>
       <w:r>
         <w:rPr>
-          <w:color w:val="555B63"/>
+          <w:color w:val="000000"/>
           <w:sz w:val="19"/>
           <w:szCs w:val="19"/>
         </w:rPr>
@@ -246,7 +246,7 @@
         <w:rPr>
           <w:i/>
           <w:iCs/>
-          <w:color w:val="555B63"/>
+          <w:color w:val="000000"/>
           <w:sz w:val="19"/>
           <w:szCs w:val="19"/>
         </w:rPr>
@@ -256,7 +256,7 @@
         <w:rPr>
           <w:i/>
           <w:iCs/>
-          <w:color w:val="555B63"/>
+          <w:color w:val="000000"/>
           <w:sz w:val="19"/>
           <w:szCs w:val="19"/>
         </w:rPr>
@@ -266,7 +266,7 @@
         <w:rPr>
           <w:i/>
           <w:iCs/>
-          <w:color w:val="555B63"/>
+          <w:color w:val="000000"/>
           <w:sz w:val="19"/>
           <w:szCs w:val="19"/>
           <w:vertAlign w:val="superscript"/>
@@ -277,7 +277,7 @@
         <w:rPr>
           <w:i/>
           <w:iCs/>
-          <w:color w:val="555B63"/>
+          <w:color w:val="000000"/>
           <w:sz w:val="19"/>
           <w:szCs w:val="19"/>
         </w:rPr>
@@ -307,7 +307,7 @@
       </w:r>
       <w:r>
         <w:rPr>
-          <w:color w:val="555B63"/>
+          <w:color w:val="000000"/>
           <w:sz w:val="19"/>
           <w:szCs w:val="19"/>
         </w:rPr>
@@ -317,7 +317,7 @@
     <w:p>
       <w:pPr>
         <w:pBdr>
-          <w:bottom w:val="single" w:color="C9D3DE" w:sz="8" w:space="2"/>
+          <w:bottom w:val="single" w:color="B5B5B5" w:sz="8" w:space="2"/>
         </w:pBdr>
         <w:spacing w:after="80" w:before="220"/>
       </w:pPr>
@@ -325,7 +325,7 @@
         <w:rPr>
           <w:b/>
           <w:bCs/>
-          <w:color w:val="0F4C81"/>
+          <w:color w:val="000000"/>
           <w:spacing w:val="15"/>
           <w:sz w:val="21"/>
           <w:szCs w:val="21"/>
@@ -356,7 +356,7 @@
       </w:r>
       <w:r>
         <w:rPr>
-          <w:color w:val="555B63"/>
+          <w:color w:val="000000"/>
           <w:sz w:val="19"/>
           <w:szCs w:val="19"/>
         </w:rPr>
@@ -427,7 +427,7 @@
       </w:r>
       <w:r>
         <w:rPr>
-          <w:color w:val="555B63"/>
+          <w:color w:val="000000"/>
           <w:sz w:val="19"/>
           <w:szCs w:val="19"/>
         </w:rPr>
@@ -457,7 +457,7 @@
       </w:r>
       <w:r>
         <w:rPr>
-          <w:color w:val="555B63"/>
+          <w:color w:val="000000"/>
           <w:sz w:val="19"/>
           <w:szCs w:val="19"/>
         </w:rPr>
@@ -480,7 +480,7 @@
     <w:p>
       <w:pPr>
         <w:pBdr>
-          <w:bottom w:val="single" w:color="C9D3DE" w:sz="8" w:space="2"/>
+          <w:bottom w:val="single" w:color="B5B5B5" w:sz="8" w:space="2"/>
         </w:pBdr>
         <w:spacing w:after="80" w:before="220"/>
       </w:pPr>
@@ -488,7 +488,7 @@
         <w:rPr>
           <w:b/>
           <w:bCs/>
-          <w:color w:val="0F4C81"/>
+          <w:color w:val="000000"/>
           <w:spacing w:val="15"/>
           <w:sz w:val="21"/>
           <w:szCs w:val="21"/>
@@ -531,7 +531,7 @@
       </w:r>
       <w:r>
         <w:rPr>
-          <w:color w:val="555B63"/>
+          <w:color w:val="000000"/>
           <w:sz w:val="19"/>
           <w:szCs w:val="19"/>
         </w:rPr>
@@ -586,7 +586,7 @@
       </w:r>
       <w:r>
         <w:rPr>
-          <w:color w:val="555B63"/>
+          <w:color w:val="000000"/>
           <w:sz w:val="19"/>
           <w:szCs w:val="19"/>
         </w:rPr>
@@ -609,7 +609,7 @@
     <w:p>
       <w:pPr>
         <w:pBdr>
-          <w:bottom w:val="single" w:color="C9D3DE" w:sz="8" w:space="2"/>
+          <w:bottom w:val="single" w:color="B5B5B5" w:sz="8" w:space="2"/>
         </w:pBdr>
         <w:spacing w:after="80" w:before="220"/>
       </w:pPr>
@@ -617,7 +617,7 @@
         <w:rPr>
           <w:b/>
           <w:bCs/>
-          <w:color w:val="0F4C81"/>
+          <w:color w:val="000000"/>
           <w:spacing w:val="15"/>
           <w:sz w:val="21"/>
           <w:szCs w:val="21"/>
@@ -633,12 +633,12 @@
         </w:tabs>
         <w:spacing w:after="20" w:before="0"/>
       </w:pPr>
-      <w:hyperlink w:history="1" r:id="rId2b3mcfgmk2drhhu7n6rwb">
+      <w:hyperlink w:history="1" r:id="rIdag1ycipsnnfkh9j97z5wd">
         <w:r>
           <w:rPr>
             <w:b/>
             <w:bCs/>
-            <w:color w:val="0F4C81"/>
+            <w:color w:val="000000"/>
           </w:rPr>
           <w:t xml:space="preserve">Oracle Cloud Infrastructure Certified Foundations Associate</w:t>
         </w:r>
@@ -651,7 +651,7 @@
       </w:r>
       <w:r>
         <w:rPr>
-          <w:color w:val="555B63"/>
+          <w:color w:val="000000"/>
           <w:sz w:val="19"/>
           <w:szCs w:val="19"/>
         </w:rPr>
@@ -666,7 +666,7 @@
         <w:rPr>
           <w:i/>
           <w:iCs/>
-          <w:color w:val="555B63"/>
+          <w:color w:val="000000"/>
           <w:sz w:val="19"/>
           <w:szCs w:val="19"/>
         </w:rPr>
@@ -681,12 +681,12 @@
         </w:tabs>
         <w:spacing w:after="20" w:before="50"/>
       </w:pPr>
-      <w:hyperlink w:history="1" r:id="rIdeegnkapycriollzuizv5o">
+      <w:hyperlink w:history="1" r:id="rId_bhu_13tagfc2s7cfcojw">
         <w:r>
           <w:rPr>
             <w:b/>
             <w:bCs/>
-            <w:color w:val="0F4C81"/>
+            <w:color w:val="000000"/>
           </w:rPr>
           <w:t xml:space="preserve">Exercice KASBAH</w:t>
         </w:r>
@@ -699,7 +699,7 @@
       </w:r>
       <w:r>
         <w:rPr>
-          <w:color w:val="555B63"/>
+          <w:color w:val="000000"/>
           <w:sz w:val="19"/>
           <w:szCs w:val="19"/>
         </w:rPr>
@@ -714,7 +714,7 @@
         <w:rPr>
           <w:i/>
           <w:iCs/>
-          <w:color w:val="555B63"/>
+          <w:color w:val="000000"/>
           <w:sz w:val="19"/>
           <w:szCs w:val="19"/>
         </w:rPr>
@@ -729,12 +729,12 @@
         </w:tabs>
         <w:spacing w:after="20" w:before="50"/>
       </w:pPr>
-      <w:hyperlink w:history="1" r:id="rIdazhmcnpfnzf_k4j3eidh1">
+      <w:hyperlink w:history="1" r:id="rIdsp4mgbxb-gkfbi0ogks2w">
         <w:r>
           <w:rPr>
             <w:b/>
             <w:bCs/>
-            <w:color w:val="0F4C81"/>
+            <w:color w:val="000000"/>
           </w:rPr>
           <w:t xml:space="preserve">Administration Linux avec Red Hat RH124</w:t>
         </w:r>
@@ -747,7 +747,7 @@
       </w:r>
       <w:r>
         <w:rPr>
-          <w:color w:val="555B63"/>
+          <w:color w:val="000000"/>
           <w:sz w:val="19"/>
           <w:szCs w:val="19"/>
         </w:rPr>
@@ -762,12 +762,12 @@
         </w:tabs>
         <w:spacing w:after="20" w:before="50"/>
       </w:pPr>
-      <w:hyperlink w:history="1" r:id="rIdsnyd7luh-bjqnyeacfktc">
+      <w:hyperlink w:history="1" r:id="rIdlquodmpcbtyzcacilias_">
         <w:r>
           <w:rPr>
             <w:b/>
             <w:bCs/>
-            <w:color w:val="0F4C81"/>
+            <w:color w:val="000000"/>
           </w:rPr>
           <w:t xml:space="preserve">The Unix Workbench</w:t>
         </w:r>
@@ -780,7 +780,7 @@
       </w:r>
       <w:r>
         <w:rPr>
-          <w:color w:val="555B63"/>
+          <w:color w:val="000000"/>
           <w:sz w:val="19"/>
           <w:szCs w:val="19"/>
         </w:rPr>
@@ -795,12 +795,12 @@
         </w:tabs>
         <w:spacing w:after="20" w:before="50"/>
       </w:pPr>
-      <w:hyperlink w:history="1" r:id="rIda95df1-23mzl20vz5ct3s">
+      <w:hyperlink w:history="1" r:id="rIdxwyj96oanejv2qovgfkph">
         <w:r>
           <w:rPr>
             <w:b/>
             <w:bCs/>
-            <w:color w:val="0F4C81"/>
+            <w:color w:val="000000"/>
           </w:rPr>
           <w:t xml:space="preserve">Python for Data Science, AI &amp; Development</w:t>
         </w:r>
@@ -813,7 +813,7 @@
       </w:r>
       <w:r>
         <w:rPr>
-          <w:color w:val="555B63"/>
+          <w:color w:val="000000"/>
           <w:sz w:val="19"/>
           <w:szCs w:val="19"/>
         </w:rPr>
@@ -823,7 +823,7 @@
     <w:p>
       <w:pPr>
         <w:pBdr>
-          <w:bottom w:val="single" w:color="C9D3DE" w:sz="8" w:space="2"/>
+          <w:bottom w:val="single" w:color="B5B5B5" w:sz="8" w:space="2"/>
         </w:pBdr>
         <w:spacing w:after="80" w:before="220"/>
       </w:pPr>
@@ -831,7 +831,7 @@
         <w:rPr>
           <w:b/>
           <w:bCs/>
-          <w:color w:val="0F4C81"/>
+          <w:color w:val="000000"/>
           <w:spacing w:val="15"/>
           <w:sz w:val="21"/>
           <w:szCs w:val="21"/>
@@ -1140,7 +1140,7 @@
         <w:ind w:left="200" w:hanging="160"/>
       </w:pPr>
       <w:rPr>
-        <w:color w:val="0F4C81"/>
+        <w:color w:val="000000"/>
       </w:rPr>
     </w:lvl>
   </w:abstractNum>
@@ -1165,7 +1165,7 @@
     <w:rPrDefault>
       <w:rPr>
         <w:rFonts w:ascii="Calibri" w:cs="Calibri" w:eastAsia="Calibri" w:hAnsi="Calibri"/>
-        <w:color w:val="1B1D21"/>
+        <w:color w:val="000000"/>
         <w:sz w:val="20"/>
         <w:szCs w:val="20"/>
         <w:lang w:val="fr-FR"/>

</xml_diff>

<commit_message>
Rewrite CV profile from the portfolio introduction
Co-Authored-By: Claude Opus 5.5 <noreply@anthropic.com>
</commit_message>
<xml_diff>
--- a/assets/cv/CV.docx
+++ b/assets/cv/CV.docx
@@ -67,7 +67,7 @@
         </w:rPr>
         <w:t xml:space="preserve">   ·   </w:t>
       </w:r>
-      <w:hyperlink w:history="1" r:id="rIdg56d2dycx2b9zayejplht">
+      <w:hyperlink w:history="1" r:id="rIdy68_7df32in2hrbgd5jdn">
         <w:r>
           <w:rPr>
             <w:color w:val="000000"/>
@@ -90,7 +90,7 @@
         </w:rPr>
         <w:t xml:space="preserve">Portfolio : </w:t>
       </w:r>
-      <w:hyperlink w:history="1" r:id="rIdu-telilavkagcsr0syyt8">
+      <w:hyperlink w:history="1" r:id="rIdapfzotfcpraqsqcmq9pak">
         <w:r>
           <w:rPr>
             <w:color w:val="000000"/>
@@ -116,7 +116,7 @@
         </w:rPr>
         <w:t xml:space="preserve">GitHub : </w:t>
       </w:r>
-      <w:hyperlink w:history="1" r:id="rIdfa0eghj5rtowyojggnooz">
+      <w:hyperlink w:history="1" r:id="rIdlkxqvq4ma9hv7zlojgccq">
         <w:r>
           <w:rPr>
             <w:color w:val="000000"/>
@@ -142,7 +142,7 @@
         </w:rPr>
         <w:t xml:space="preserve">LinkedIn : </w:t>
       </w:r>
-      <w:hyperlink w:history="1" r:id="rIdfnhlgio3-0zrubfpfwdmd">
+      <w:hyperlink w:history="1" r:id="rIdbwl9bxmuvpei7ddfc7nm8">
         <w:r>
           <w:rPr>
             <w:color w:val="000000"/>
@@ -174,19 +174,7 @@
     </w:p>
     <w:p>
       <w:r>
-        <w:t xml:space="preserve">Élève ingénieur en </w:t>
-      </w:r>
-      <w:r>
-        <w:t xml:space="preserve">5</w:t>
-      </w:r>
-      <w:r>
-        <w:rPr>
-          <w:vertAlign w:val="superscript"/>
-        </w:rPr>
-        <w:t xml:space="preserve">e</w:t>
-      </w:r>
-      <w:r>
-        <w:t xml:space="preserve"> année de cybersécurité (diplôme prévu en 2027). En stage, développement d'un framework automatisé de détection des vulnérabilités XSS (DAST) ; expérience en déploiement (Docker, Kubernetes) et en supervision (Prometheus, Grafana). Recherche un stage de fin d'études en sécurité applicative, tests d'intrusion ou DevSecOps.</w:t>
+        <w:t xml:space="preserve">Élève ingénieur en informatique, orienté cybersécurité et tests d'intrusion. Je m'intéresse particulièrement à l'identification des vulnérabilités, à la sécurisation des systèmes numériques et à l'intégration de la sécurité dans les pipelines cloud et DevSecOps, ainsi qu'au développement d'applications full-stack.</w:t>
       </w:r>
     </w:p>
     <w:p>
@@ -633,7 +621,7 @@
         </w:tabs>
         <w:spacing w:after="20" w:before="0"/>
       </w:pPr>
-      <w:hyperlink w:history="1" r:id="rIdag1ycipsnnfkh9j97z5wd">
+      <w:hyperlink w:history="1" r:id="rIdbceeftgh6pnm69obeacrm">
         <w:r>
           <w:rPr>
             <w:b/>
@@ -681,7 +669,7 @@
         </w:tabs>
         <w:spacing w:after="20" w:before="50"/>
       </w:pPr>
-      <w:hyperlink w:history="1" r:id="rId_bhu_13tagfc2s7cfcojw">
+      <w:hyperlink w:history="1" r:id="rId-eetobsfkftnxizwe_tsf">
         <w:r>
           <w:rPr>
             <w:b/>
@@ -729,7 +717,7 @@
         </w:tabs>
         <w:spacing w:after="20" w:before="50"/>
       </w:pPr>
-      <w:hyperlink w:history="1" r:id="rIdsp4mgbxb-gkfbi0ogks2w">
+      <w:hyperlink w:history="1" r:id="rIdhd-ox_3zoic24tfepeloc">
         <w:r>
           <w:rPr>
             <w:b/>
@@ -762,7 +750,7 @@
         </w:tabs>
         <w:spacing w:after="20" w:before="50"/>
       </w:pPr>
-      <w:hyperlink w:history="1" r:id="rIdlquodmpcbtyzcacilias_">
+      <w:hyperlink w:history="1" r:id="rIdr2r3bgedf-9rtlc7usipw">
         <w:r>
           <w:rPr>
             <w:b/>
@@ -795,7 +783,7 @@
         </w:tabs>
         <w:spacing w:after="20" w:before="50"/>
       </w:pPr>
-      <w:hyperlink w:history="1" r:id="rIdxwyj96oanejv2qovgfkph">
+      <w:hyperlink w:history="1" r:id="rIdownvqpsyihepw0mmbdjov">
         <w:r>
           <w:rPr>
             <w:b/>

</xml_diff>

<commit_message>
Restructure CV and fix PDF text reading order
Bullets now use native list markers so the PDF text layer keeps each
description under its entry; action-verb bullets, concrete profile,
certifications sorted by date, KASBAH moved to a new Activités section.

Co-Authored-By: Claude Opus 5.5 <noreply@anthropic.com>
</commit_message>
<xml_diff>
--- a/assets/cv/CV.docx
+++ b/assets/cv/CV.docx
@@ -24,7 +24,6 @@
         <w:rPr>
           <w:b/>
           <w:bCs/>
-          <w:color w:val="000000"/>
           <w:sz w:val="24"/>
           <w:szCs w:val="24"/>
         </w:rPr>
@@ -37,7 +36,6 @@
       </w:pPr>
       <w:r>
         <w:rPr>
-          <w:color w:val="000000"/>
           <w:sz w:val="19"/>
           <w:szCs w:val="19"/>
         </w:rPr>
@@ -45,7 +43,6 @@
       </w:r>
       <w:r>
         <w:rPr>
-          <w:color w:val="000000"/>
           <w:sz w:val="19"/>
           <w:szCs w:val="19"/>
         </w:rPr>
@@ -53,7 +50,6 @@
       </w:r>
       <w:r>
         <w:rPr>
-          <w:color w:val="000000"/>
           <w:sz w:val="19"/>
           <w:szCs w:val="19"/>
         </w:rPr>
@@ -61,13 +57,12 @@
       </w:r>
       <w:r>
         <w:rPr>
-          <w:color w:val="000000"/>
           <w:sz w:val="19"/>
           <w:szCs w:val="19"/>
         </w:rPr>
         <w:t xml:space="preserve">   ·   </w:t>
       </w:r>
-      <w:hyperlink w:history="1" r:id="rIdy68_7df32in2hrbgd5jdn">
+      <w:hyperlink w:history="1" r:id="rId4tk-qxvsdshlnjjjnrg9h">
         <w:r>
           <w:rPr>
             <w:color w:val="000000"/>
@@ -84,13 +79,12 @@
       </w:pPr>
       <w:r>
         <w:rPr>
-          <w:color w:val="000000"/>
           <w:sz w:val="19"/>
           <w:szCs w:val="19"/>
         </w:rPr>
         <w:t xml:space="preserve">Portfolio : </w:t>
       </w:r>
-      <w:hyperlink w:history="1" r:id="rIdapfzotfcpraqsqcmq9pak">
+      <w:hyperlink w:history="1" r:id="rIdylh7kx-bdvpula5wo5ox4">
         <w:r>
           <w:rPr>
             <w:color w:val="000000"/>
@@ -102,7 +96,6 @@
       </w:hyperlink>
       <w:r>
         <w:rPr>
-          <w:color w:val="000000"/>
           <w:sz w:val="19"/>
           <w:szCs w:val="19"/>
         </w:rPr>
@@ -110,13 +103,12 @@
       </w:r>
       <w:r>
         <w:rPr>
-          <w:color w:val="000000"/>
           <w:sz w:val="19"/>
           <w:szCs w:val="19"/>
         </w:rPr>
         <w:t xml:space="preserve">GitHub : </w:t>
       </w:r>
-      <w:hyperlink w:history="1" r:id="rIdlkxqvq4ma9hv7zlojgccq">
+      <w:hyperlink w:history="1" r:id="rIdj8ogfq0vb0rq1_1-tgfei">
         <w:r>
           <w:rPr>
             <w:color w:val="000000"/>
@@ -128,7 +120,6 @@
       </w:hyperlink>
       <w:r>
         <w:rPr>
-          <w:color w:val="000000"/>
           <w:sz w:val="19"/>
           <w:szCs w:val="19"/>
         </w:rPr>
@@ -136,13 +127,12 @@
       </w:r>
       <w:r>
         <w:rPr>
-          <w:color w:val="000000"/>
           <w:sz w:val="19"/>
           <w:szCs w:val="19"/>
         </w:rPr>
         <w:t xml:space="preserve">LinkedIn : </w:t>
       </w:r>
-      <w:hyperlink w:history="1" r:id="rIdbwl9bxmuvpei7ddfc7nm8">
+      <w:hyperlink w:history="1" r:id="rId12waskvslau2h3ewvzcng">
         <w:r>
           <w:rPr>
             <w:color w:val="000000"/>
@@ -155,16 +145,16 @@
     </w:p>
     <w:p>
       <w:pPr>
+        <w:keepNext/>
         <w:pBdr>
           <w:bottom w:val="single" w:color="B5B5B5" w:sz="8" w:space="2"/>
         </w:pBdr>
-        <w:spacing w:after="80" w:before="220"/>
-      </w:pPr>
-      <w:r>
-        <w:rPr>
-          <w:b/>
-          <w:bCs/>
-          <w:color w:val="000000"/>
+        <w:spacing w:after="80" w:before="240"/>
+      </w:pPr>
+      <w:r>
+        <w:rPr>
+          <w:b/>
+          <w:bCs/>
           <w:spacing w:val="15"/>
           <w:sz w:val="21"/>
           <w:szCs w:val="21"/>
@@ -174,21 +164,21 @@
     </w:p>
     <w:p>
       <w:r>
-        <w:t xml:space="preserve">Élève ingénieur en informatique, orienté cybersécurité et tests d'intrusion. Je m'intéresse particulièrement à l'identification des vulnérabilités, à la sécurisation des systèmes numériques et à l'intégration de la sécurité dans les pipelines cloud et DevSecOps, ainsi qu'au développement d'applications full-stack.</w:t>
-      </w:r>
-    </w:p>
-    <w:p>
-      <w:pPr>
+        <w:t xml:space="preserve">Élève ingénieur en 5ᵉ année de cybersécurité à l'EMSI Rabat. J'ai conçu un pipeline automatisé de détection des vulnérabilités XSS (DAST), déployé une application sur Kubernetes dans le cloud et mis en place une supervision Prometheus/Grafana. Je recherche un stage de fin d'études (PFE) en 2027 en sécurité applicative, tests d'intrusion ou DevSecOps.</w:t>
+      </w:r>
+    </w:p>
+    <w:p>
+      <w:pPr>
+        <w:keepNext/>
         <w:pBdr>
           <w:bottom w:val="single" w:color="B5B5B5" w:sz="8" w:space="2"/>
         </w:pBdr>
-        <w:spacing w:after="80" w:before="220"/>
-      </w:pPr>
-      <w:r>
-        <w:rPr>
-          <w:b/>
-          <w:bCs/>
-          <w:color w:val="000000"/>
+        <w:spacing w:after="80" w:before="240"/>
+      </w:pPr>
+      <w:r>
+        <w:rPr>
+          <w:b/>
+          <w:bCs/>
           <w:spacing w:val="15"/>
           <w:sz w:val="21"/>
           <w:szCs w:val="21"/>
@@ -212,14 +202,13 @@
         <w:t xml:space="preserve">Diplôme d'ingénieur — Cybersécurité et systèmes d'information</w:t>
       </w:r>
       <w:r>
-        <w:t xml:space="preserve"> · diplôme prévu en 2027</w:t>
+        <w:t xml:space="preserve"> · EMSI Rabat · diplôme prévu en 2027</w:t>
       </w:r>
       <w:r>
         <w:t xml:space="preserve">	</w:t>
       </w:r>
       <w:r>
         <w:rPr>
-          <w:color w:val="000000"/>
           <w:sz w:val="19"/>
           <w:szCs w:val="19"/>
         </w:rPr>
@@ -228,92 +217,16 @@
     </w:p>
     <w:p>
       <w:pPr>
-        <w:spacing w:after="0"/>
-      </w:pPr>
-      <w:r>
-        <w:rPr>
-          <w:i/>
-          <w:iCs/>
-          <w:color w:val="000000"/>
-          <w:sz w:val="19"/>
-          <w:szCs w:val="19"/>
-        </w:rPr>
-        <w:t xml:space="preserve">École Marocaine des Sciences de l'Ingénieur (EMSI), Rabat · actuellement en </w:t>
-      </w:r>
-      <w:r>
-        <w:rPr>
-          <w:i/>
-          <w:iCs/>
-          <w:color w:val="000000"/>
-          <w:sz w:val="19"/>
-          <w:szCs w:val="19"/>
-        </w:rPr>
-        <w:t xml:space="preserve">5</w:t>
-      </w:r>
-      <w:r>
-        <w:rPr>
-          <w:i/>
-          <w:iCs/>
-          <w:color w:val="000000"/>
-          <w:sz w:val="19"/>
-          <w:szCs w:val="19"/>
-          <w:vertAlign w:val="superscript"/>
-        </w:rPr>
-        <w:t xml:space="preserve">e</w:t>
-      </w:r>
-      <w:r>
-        <w:rPr>
-          <w:i/>
-          <w:iCs/>
-          <w:color w:val="000000"/>
-          <w:sz w:val="19"/>
-          <w:szCs w:val="19"/>
-        </w:rPr>
-        <w:t xml:space="preserve"> année</w:t>
-      </w:r>
-    </w:p>
-    <w:p>
-      <w:pPr>
-        <w:keepNext/>
-        <w:tabs>
-          <w:tab w:val="right" w:pos="10206"/>
-        </w:tabs>
-        <w:spacing w:after="20" w:before="100"/>
-      </w:pPr>
-      <w:r>
-        <w:rPr>
-          <w:b/>
-          <w:bCs/>
-        </w:rPr>
-        <w:t xml:space="preserve">Baccalauréat Sciences physiques et chimiques</w:t>
-      </w:r>
-      <w:r>
-        <w:t xml:space="preserve"> · Lycée Al-Ghazali, Témara</w:t>
-      </w:r>
-      <w:r>
-        <w:t xml:space="preserve">	</w:t>
-      </w:r>
-      <w:r>
-        <w:rPr>
-          <w:color w:val="000000"/>
-          <w:sz w:val="19"/>
-          <w:szCs w:val="19"/>
-        </w:rPr>
-        <w:t xml:space="preserve">2022</w:t>
-      </w:r>
-    </w:p>
-    <w:p>
-      <w:pPr>
+        <w:keepNext/>
         <w:pBdr>
           <w:bottom w:val="single" w:color="B5B5B5" w:sz="8" w:space="2"/>
         </w:pBdr>
-        <w:spacing w:after="80" w:before="220"/>
-      </w:pPr>
-      <w:r>
-        <w:rPr>
-          <w:b/>
-          <w:bCs/>
-          <w:color w:val="000000"/>
+        <w:spacing w:after="80" w:before="240"/>
+      </w:pPr>
+      <w:r>
+        <w:rPr>
+          <w:b/>
+          <w:bCs/>
           <w:spacing w:val="15"/>
           <w:sz w:val="21"/>
           <w:szCs w:val="21"/>
@@ -344,7 +257,6 @@
       </w:r>
       <w:r>
         <w:rPr>
-          <w:color w:val="000000"/>
           <w:sz w:val="19"/>
           <w:szCs w:val="19"/>
         </w:rPr>
@@ -361,7 +273,7 @@
         <w:spacing w:after="0" w:before="20"/>
       </w:pPr>
       <w:r>
-        <w:t xml:space="preserve">Framework DAST de détection des vulnérabilités XSS, piloté par une interface web FastAPI (scans, suivi, historique).</w:t>
+        <w:t xml:space="preserve">Conçu un framework DAST de détection XSS, piloté par une interface web FastAPI (scans, suivi, historique).</w:t>
       </w:r>
     </w:p>
     <w:p>
@@ -374,7 +286,7 @@
         <w:spacing w:after="0" w:before="20"/>
       </w:pPr>
       <w:r>
-        <w:t xml:space="preserve">Crawler Playwright (pages JavaScript, URL, formulaires, </w:t>
+        <w:t xml:space="preserve">Orchestré un crawler Playwright (URL, formulaires, </w:t>
       </w:r>
       <w:r>
         <w:rPr>
@@ -384,7 +296,7 @@
         <w:t xml:space="preserve">sinks</w:t>
       </w:r>
       <w:r>
-        <w:t xml:space="preserve"> DOM-XSS) ; XSStrike et DalFox en conteneurs Docker isolés.</w:t>
+        <w:t xml:space="preserve"> DOM-XSS) et XSStrike/DalFox en conteneurs Docker isolés.</w:t>
       </w:r>
     </w:p>
     <w:p>
@@ -397,59 +309,7 @@
         <w:spacing w:after="0" w:before="20"/>
       </w:pPr>
       <w:r>
-        <w:t xml:space="preserve">Normalisation et déduplication des résultats, rapports HTML et PDF automatiques ; tests limités à une cible autorisée (OWASP Juice Shop en local).</w:t>
-      </w:r>
-    </w:p>
-    <w:p>
-      <w:pPr>
-        <w:spacing w:after="0" w:before="30"/>
-      </w:pPr>
-      <w:r>
-        <w:rPr>
-          <w:b/>
-          <w:bCs/>
-          <w:sz w:val="19"/>
-          <w:szCs w:val="19"/>
-        </w:rPr>
-        <w:t xml:space="preserve">Environnement : </w:t>
-      </w:r>
-      <w:r>
-        <w:rPr>
-          <w:color w:val="000000"/>
-          <w:sz w:val="19"/>
-          <w:szCs w:val="19"/>
-        </w:rPr>
-        <w:t xml:space="preserve">Python, FastAPI, Playwright, XSStrike, DalFox, Docker, Jinja2, ReportLab</w:t>
-      </w:r>
-    </w:p>
-    <w:p>
-      <w:pPr>
-        <w:keepNext/>
-        <w:tabs>
-          <w:tab w:val="right" w:pos="10206"/>
-        </w:tabs>
-        <w:spacing w:after="20" w:before="100"/>
-      </w:pPr>
-      <w:r>
-        <w:rPr>
-          <w:b/>
-          <w:bCs/>
-        </w:rPr>
-        <w:t xml:space="preserve">YZY Digital Technologies</w:t>
-      </w:r>
-      <w:r>
-        <w:t xml:space="preserve"> — Stage d'été : déploiement cloud et DevSecOps</w:t>
-      </w:r>
-      <w:r>
-        <w:t xml:space="preserve">	</w:t>
-      </w:r>
-      <w:r>
-        <w:rPr>
-          <w:color w:val="000000"/>
-          <w:sz w:val="19"/>
-          <w:szCs w:val="19"/>
-        </w:rPr>
-        <w:t xml:space="preserve">Juillet – septembre 2025</w:t>
+        <w:t xml:space="preserve">Normalisé et dédupliqué les résultats des deux scanners ; généré automatiquement des rapports HTML et PDF.</w:t>
       </w:r>
     </w:p>
     <w:p>
@@ -462,26 +322,28 @@
         <w:spacing w:after="0" w:before="20"/>
       </w:pPr>
       <w:r>
-        <w:t xml:space="preserve">Déploiement d'une application dans le cloud : conteneurisation avec Docker et déploiement sur Kubernetes.</w:t>
-      </w:r>
-    </w:p>
-    <w:p>
-      <w:pPr>
-        <w:pBdr>
-          <w:bottom w:val="single" w:color="B5B5B5" w:sz="8" w:space="2"/>
-        </w:pBdr>
-        <w:spacing w:after="80" w:before="220"/>
-      </w:pPr>
-      <w:r>
-        <w:rPr>
-          <w:b/>
-          <w:bCs/>
-          <w:color w:val="000000"/>
-          <w:spacing w:val="15"/>
-          <w:sz w:val="21"/>
-          <w:szCs w:val="21"/>
-        </w:rPr>
-        <w:t xml:space="preserve">PROJETS EN CYBERSÉCURITÉ</w:t>
+        <w:t xml:space="preserve">Validé l'outil sur une cible autorisée (OWASP Juice Shop en local).</w:t>
+      </w:r>
+    </w:p>
+    <w:p>
+      <w:pPr>
+        <w:spacing w:after="0" w:before="30"/>
+      </w:pPr>
+      <w:r>
+        <w:rPr>
+          <w:b/>
+          <w:bCs/>
+          <w:sz w:val="19"/>
+          <w:szCs w:val="19"/>
+        </w:rPr>
+        <w:t xml:space="preserve">Environnement : </w:t>
+      </w:r>
+      <w:r>
+        <w:rPr>
+          <w:sz w:val="19"/>
+          <w:szCs w:val="19"/>
+        </w:rPr>
+        <w:t xml:space="preserve">Python, FastAPI, Playwright, XSStrike, DalFox, Docker, Jinja2, ReportLab</w:t>
       </w:r>
     </w:p>
     <w:p>
@@ -490,40 +352,27 @@
         <w:tabs>
           <w:tab w:val="right" w:pos="10206"/>
         </w:tabs>
-        <w:spacing w:after="20" w:before="0"/>
-      </w:pPr>
-      <w:r>
-        <w:rPr>
-          <w:b/>
-          <w:bCs/>
-        </w:rPr>
-        <w:t xml:space="preserve">Architecture de supervision des systèmes</w:t>
-      </w:r>
-      <w:r>
-        <w:t xml:space="preserve"> — Projet académique (PFA), </w:t>
-      </w:r>
-      <w:r>
-        <w:t xml:space="preserve">4</w:t>
-      </w:r>
-      <w:r>
-        <w:rPr>
-          <w:vertAlign w:val="superscript"/>
-        </w:rPr>
-        <w:t xml:space="preserve">e</w:t>
-      </w:r>
-      <w:r>
-        <w:t xml:space="preserve"> année</w:t>
+        <w:spacing w:after="20" w:before="100"/>
+      </w:pPr>
+      <w:r>
+        <w:rPr>
+          <w:b/>
+          <w:bCs/>
+        </w:rPr>
+        <w:t xml:space="preserve">YZY Digital Technologies</w:t>
+      </w:r>
+      <w:r>
+        <w:t xml:space="preserve"> — Stage d'été : déploiement cloud et DevSecOps</w:t>
       </w:r>
       <w:r>
         <w:t xml:space="preserve">	</w:t>
       </w:r>
       <w:r>
         <w:rPr>
-          <w:color w:val="000000"/>
-          <w:sz w:val="19"/>
-          <w:szCs w:val="19"/>
-        </w:rPr>
-        <w:t xml:space="preserve">2025 – 2026</w:t>
+          <w:sz w:val="19"/>
+          <w:szCs w:val="19"/>
+        </w:rPr>
+        <w:t xml:space="preserve">Juillet – septembre 2025</w:t>
       </w:r>
     </w:p>
     <w:p>
@@ -536,7 +385,26 @@
         <w:spacing w:after="0" w:before="20"/>
       </w:pPr>
       <w:r>
-        <w:t xml:space="preserve">Métriques système collectées par Node Exporter, stockées dans Prometheus et visualisées dans Grafana (mémoire, trafic réseau, espace disque), pour une visibilité continue dans une approche de sécurité défensive.</w:t>
+        <w:t xml:space="preserve">Conteneurisé une application avec Docker et réalisé son déploiement sur Kubernetes dans le cloud.</w:t>
+      </w:r>
+    </w:p>
+    <w:p>
+      <w:pPr>
+        <w:keepNext/>
+        <w:pBdr>
+          <w:bottom w:val="single" w:color="B5B5B5" w:sz="8" w:space="2"/>
+        </w:pBdr>
+        <w:spacing w:after="80" w:before="240"/>
+      </w:pPr>
+      <w:r>
+        <w:rPr>
+          <w:b/>
+          <w:bCs/>
+          <w:spacing w:val="15"/>
+          <w:sz w:val="21"/>
+          <w:szCs w:val="21"/>
+        </w:rPr>
+        <w:t xml:space="preserve">PROJETS EN CYBERSÉCURITÉ</w:t>
       </w:r>
     </w:p>
     <w:p>
@@ -545,36 +413,23 @@
         <w:tabs>
           <w:tab w:val="right" w:pos="10206"/>
         </w:tabs>
-        <w:spacing w:after="20" w:before="100"/>
-      </w:pPr>
-      <w:r>
-        <w:rPr>
-          <w:b/>
-          <w:bCs/>
-        </w:rPr>
-        <w:t xml:space="preserve">Laboratoire de simulation de phishing</w:t>
-      </w:r>
-      <w:r>
-        <w:t xml:space="preserve"> — Projet académique, </w:t>
-      </w:r>
-      <w:r>
-        <w:t xml:space="preserve">4</w:t>
-      </w:r>
-      <w:r>
-        <w:rPr>
-          <w:vertAlign w:val="superscript"/>
-        </w:rPr>
-        <w:t xml:space="preserve">e</w:t>
-      </w:r>
-      <w:r>
-        <w:t xml:space="preserve"> année</w:t>
+        <w:spacing w:after="20" w:before="0"/>
+      </w:pPr>
+      <w:r>
+        <w:rPr>
+          <w:b/>
+          <w:bCs/>
+        </w:rPr>
+        <w:t xml:space="preserve">Architecture de supervision des systèmes</w:t>
+      </w:r>
+      <w:r>
+        <w:t xml:space="preserve"> — Projet académique (PFA), 4ᵉ année</w:t>
       </w:r>
       <w:r>
         <w:t xml:space="preserve">	</w:t>
       </w:r>
       <w:r>
         <w:rPr>
-          <w:color w:val="000000"/>
           <w:sz w:val="19"/>
           <w:szCs w:val="19"/>
         </w:rPr>
@@ -591,21 +446,63 @@
         <w:spacing w:after="0" w:before="20"/>
       </w:pPr>
       <w:r>
-        <w:t xml:space="preserve">Page de connexion répliquée pour un exercice pédagogique de sensibilisation au phishing (HTML, JavaScript, Docker).</w:t>
-      </w:r>
-    </w:p>
-    <w:p>
-      <w:pPr>
+        <w:t xml:space="preserve">Mis en place une supervision Node Exporter, Prometheus et Grafana (mémoire, trafic réseau, espace disque) dans une approche de sécurité défensive.</w:t>
+      </w:r>
+    </w:p>
+    <w:p>
+      <w:pPr>
+        <w:keepNext/>
+        <w:tabs>
+          <w:tab w:val="right" w:pos="10206"/>
+        </w:tabs>
+        <w:spacing w:after="20" w:before="100"/>
+      </w:pPr>
+      <w:r>
+        <w:rPr>
+          <w:b/>
+          <w:bCs/>
+        </w:rPr>
+        <w:t xml:space="preserve">Laboratoire de simulation de phishing</w:t>
+      </w:r>
+      <w:r>
+        <w:t xml:space="preserve"> — Projet académique, 4ᵉ année · HTML, JavaScript, Docker</w:t>
+      </w:r>
+      <w:r>
+        <w:t xml:space="preserve">	</w:t>
+      </w:r>
+      <w:r>
+        <w:rPr>
+          <w:sz w:val="19"/>
+          <w:szCs w:val="19"/>
+        </w:rPr>
+        <w:t xml:space="preserve">2025 – 2026</w:t>
+      </w:r>
+    </w:p>
+    <w:p>
+      <w:pPr>
+        <w:pStyle w:val="ListParagraph"/>
+        <w:numPr>
+          <w:ilvl w:val="0"/>
+          <w:numId w:val="2"/>
+        </w:numPr>
+        <w:spacing w:after="0" w:before="20"/>
+      </w:pPr>
+      <w:r>
+        <w:t xml:space="preserve">Conçu une page de connexion répliquée pour un exercice pédagogique autorisé de sensibilisation au phishing.</w:t>
+      </w:r>
+    </w:p>
+    <w:p>
+      <w:pPr>
+        <w:keepNext/>
         <w:pBdr>
           <w:bottom w:val="single" w:color="B5B5B5" w:sz="8" w:space="2"/>
         </w:pBdr>
-        <w:spacing w:after="80" w:before="220"/>
-      </w:pPr>
-      <w:r>
-        <w:rPr>
-          <w:b/>
-          <w:bCs/>
-          <w:color w:val="000000"/>
+        <w:spacing w:after="80" w:before="240"/>
+      </w:pPr>
+      <w:r>
+        <w:rPr>
+          <w:b/>
+          <w:bCs/>
           <w:spacing w:val="15"/>
           <w:sz w:val="21"/>
           <w:szCs w:val="21"/>
@@ -621,7 +518,7 @@
         </w:tabs>
         <w:spacing w:after="20" w:before="0"/>
       </w:pPr>
-      <w:hyperlink w:history="1" r:id="rIdbceeftgh6pnm69obeacrm">
+      <w:hyperlink w:history="1" r:id="rIdw7gzwrxc4dgqtlvq2r7pk">
         <w:r>
           <w:rPr>
             <w:b/>
@@ -632,14 +529,13 @@
         </w:r>
       </w:hyperlink>
       <w:r>
-        <w:t xml:space="preserve"> — Oracle</w:t>
+        <w:t xml:space="preserve"> — Oracle · certification professionnelle</w:t>
       </w:r>
       <w:r>
         <w:t xml:space="preserve">	</w:t>
       </w:r>
       <w:r>
         <w:rPr>
-          <w:color w:val="000000"/>
           <w:sz w:val="19"/>
           <w:szCs w:val="19"/>
         </w:rPr>
@@ -647,18 +543,14 @@
       </w:r>
     </w:p>
     <w:p>
-      <w:pPr>
-        <w:spacing w:after="0"/>
-      </w:pPr>
       <w:r>
         <w:rPr>
           <w:i/>
           <w:iCs/>
-          <w:color w:val="000000"/>
-          <w:sz w:val="19"/>
-          <w:szCs w:val="19"/>
-        </w:rPr>
-        <w:t xml:space="preserve">Certification professionnelle vérifiée · délivrée le 9 septembre 2026, valide jusqu'au 9 septembre 2028</w:t>
+          <w:sz w:val="19"/>
+          <w:szCs w:val="19"/>
+        </w:rPr>
+        <w:t xml:space="preserve">Certification vérifiée · délivrée le 9 septembre 2026, valide jusqu'au 9 septembre 2028</w:t>
       </w:r>
     </w:p>
     <w:p>
@@ -669,7 +561,122 @@
         </w:tabs>
         <w:spacing w:after="20" w:before="50"/>
       </w:pPr>
-      <w:hyperlink w:history="1" r:id="rId-eetobsfkftnxizwe_tsf">
+      <w:hyperlink w:history="1" r:id="rIdfuwclhsn_l8jg-sext5vu">
+        <w:r>
+          <w:rPr>
+            <w:b/>
+            <w:bCs/>
+            <w:color w:val="000000"/>
+          </w:rPr>
+          <w:t xml:space="preserve">Administration Linux avec Red Hat RH124</w:t>
+        </w:r>
+      </w:hyperlink>
+      <w:r>
+        <w:t xml:space="preserve"> — Honoris · certificat de cours en ligne (Coursera)</w:t>
+      </w:r>
+      <w:r>
+        <w:t xml:space="preserve">	</w:t>
+      </w:r>
+      <w:r>
+        <w:rPr>
+          <w:sz w:val="19"/>
+          <w:szCs w:val="19"/>
+        </w:rPr>
+        <w:t xml:space="preserve">Mai 2026</w:t>
+      </w:r>
+    </w:p>
+    <w:p>
+      <w:pPr>
+        <w:keepNext/>
+        <w:tabs>
+          <w:tab w:val="right" w:pos="10206"/>
+        </w:tabs>
+        <w:spacing w:after="20" w:before="50"/>
+      </w:pPr>
+      <w:hyperlink w:history="1" r:id="rIdpkrxyu99tqzekqslvo336">
+        <w:r>
+          <w:rPr>
+            <w:b/>
+            <w:bCs/>
+            <w:color w:val="000000"/>
+          </w:rPr>
+          <w:t xml:space="preserve">Python for Data Science, AI &amp; Development</w:t>
+        </w:r>
+      </w:hyperlink>
+      <w:r>
+        <w:t xml:space="preserve"> — IBM · certificat de cours en ligne (Coursera)</w:t>
+      </w:r>
+      <w:r>
+        <w:t xml:space="preserve">	</w:t>
+      </w:r>
+      <w:r>
+        <w:rPr>
+          <w:sz w:val="19"/>
+          <w:szCs w:val="19"/>
+        </w:rPr>
+        <w:t xml:space="preserve">Novembre 2025</w:t>
+      </w:r>
+    </w:p>
+    <w:p>
+      <w:pPr>
+        <w:keepNext/>
+        <w:tabs>
+          <w:tab w:val="right" w:pos="10206"/>
+        </w:tabs>
+        <w:spacing w:after="20" w:before="50"/>
+      </w:pPr>
+      <w:hyperlink w:history="1" r:id="rIdckvuscvbvko91--_dbszj">
+        <w:r>
+          <w:rPr>
+            <w:b/>
+            <w:bCs/>
+            <w:color w:val="000000"/>
+          </w:rPr>
+          <w:t xml:space="preserve">The Unix Workbench</w:t>
+        </w:r>
+      </w:hyperlink>
+      <w:r>
+        <w:t xml:space="preserve"> — Johns Hopkins University · certificat de cours en ligne (Coursera)</w:t>
+      </w:r>
+      <w:r>
+        <w:t xml:space="preserve">	</w:t>
+      </w:r>
+      <w:r>
+        <w:rPr>
+          <w:sz w:val="19"/>
+          <w:szCs w:val="19"/>
+        </w:rPr>
+        <w:t xml:space="preserve">Décembre 2024</w:t>
+      </w:r>
+    </w:p>
+    <w:p>
+      <w:pPr>
+        <w:keepNext/>
+        <w:pBdr>
+          <w:bottom w:val="single" w:color="B5B5B5" w:sz="8" w:space="2"/>
+        </w:pBdr>
+        <w:spacing w:after="80" w:before="240"/>
+      </w:pPr>
+      <w:r>
+        <w:rPr>
+          <w:b/>
+          <w:bCs/>
+          <w:spacing w:val="15"/>
+          <w:sz w:val="21"/>
+          <w:szCs w:val="21"/>
+        </w:rPr>
+        <w:t xml:space="preserve">ACTIVITÉS</w:t>
+      </w:r>
+    </w:p>
+    <w:p>
+      <w:pPr>
+        <w:keepNext/>
+        <w:tabs>
+          <w:tab w:val="right" w:pos="10206"/>
+        </w:tabs>
+        <w:spacing w:after="20" w:before="0"/>
+      </w:pPr>
+      <w:hyperlink w:history="1" r:id="rIdrmi0dfd01l2r_wkxewzcg">
         <w:r>
           <w:rPr>
             <w:b/>
@@ -680,151 +687,17 @@
         </w:r>
       </w:hyperlink>
       <w:r>
-        <w:t xml:space="preserve"> — serious game de gestion de crise cyber, EMSI et CyberSup</w:t>
+        <w:t xml:space="preserve"> — serious game de crise cyber, EMSI et CyberSup · certificat de participation</w:t>
       </w:r>
       <w:r>
         <w:t xml:space="preserve">	</w:t>
       </w:r>
       <w:r>
         <w:rPr>
-          <w:color w:val="000000"/>
           <w:sz w:val="19"/>
           <w:szCs w:val="19"/>
         </w:rPr>
         <w:t xml:space="preserve">23–25 septembre 2026</w:t>
-      </w:r>
-    </w:p>
-    <w:p>
-      <w:pPr>
-        <w:spacing w:after="0"/>
-      </w:pPr>
-      <w:r>
-        <w:rPr>
-          <w:i/>
-          <w:iCs/>
-          <w:color w:val="000000"/>
-          <w:sz w:val="19"/>
-          <w:szCs w:val="19"/>
-        </w:rPr>
-        <w:t xml:space="preserve">Certificat de participation · campus de Rabat, Cellule 3 (pôle Continuité d'activité)</w:t>
-      </w:r>
-    </w:p>
-    <w:p>
-      <w:pPr>
-        <w:keepNext/>
-        <w:tabs>
-          <w:tab w:val="right" w:pos="10206"/>
-        </w:tabs>
-        <w:spacing w:after="20" w:before="50"/>
-      </w:pPr>
-      <w:hyperlink w:history="1" r:id="rIdhd-ox_3zoic24tfepeloc">
-        <w:r>
-          <w:rPr>
-            <w:b/>
-            <w:bCs/>
-            <w:color w:val="000000"/>
-          </w:rPr>
-          <w:t xml:space="preserve">Administration Linux avec Red Hat RH124</w:t>
-        </w:r>
-      </w:hyperlink>
-      <w:r>
-        <w:t xml:space="preserve"> — Honoris · certificat de cours en ligne (Coursera)</w:t>
-      </w:r>
-      <w:r>
-        <w:t xml:space="preserve">	</w:t>
-      </w:r>
-      <w:r>
-        <w:rPr>
-          <w:color w:val="000000"/>
-          <w:sz w:val="19"/>
-          <w:szCs w:val="19"/>
-        </w:rPr>
-        <w:t xml:space="preserve">Mai 2026</w:t>
-      </w:r>
-    </w:p>
-    <w:p>
-      <w:pPr>
-        <w:keepNext/>
-        <w:tabs>
-          <w:tab w:val="right" w:pos="10206"/>
-        </w:tabs>
-        <w:spacing w:after="20" w:before="50"/>
-      </w:pPr>
-      <w:hyperlink w:history="1" r:id="rIdr2r3bgedf-9rtlc7usipw">
-        <w:r>
-          <w:rPr>
-            <w:b/>
-            <w:bCs/>
-            <w:color w:val="000000"/>
-          </w:rPr>
-          <w:t xml:space="preserve">The Unix Workbench</w:t>
-        </w:r>
-      </w:hyperlink>
-      <w:r>
-        <w:t xml:space="preserve"> — Johns Hopkins University · certificat de cours en ligne (Coursera)</w:t>
-      </w:r>
-      <w:r>
-        <w:t xml:space="preserve">	</w:t>
-      </w:r>
-      <w:r>
-        <w:rPr>
-          <w:color w:val="000000"/>
-          <w:sz w:val="19"/>
-          <w:szCs w:val="19"/>
-        </w:rPr>
-        <w:t xml:space="preserve">Décembre 2024</w:t>
-      </w:r>
-    </w:p>
-    <w:p>
-      <w:pPr>
-        <w:keepNext/>
-        <w:tabs>
-          <w:tab w:val="right" w:pos="10206"/>
-        </w:tabs>
-        <w:spacing w:after="20" w:before="50"/>
-      </w:pPr>
-      <w:hyperlink w:history="1" r:id="rIdownvqpsyihepw0mmbdjov">
-        <w:r>
-          <w:rPr>
-            <w:b/>
-            <w:bCs/>
-            <w:color w:val="000000"/>
-          </w:rPr>
-          <w:t xml:space="preserve">Python for Data Science, AI &amp; Development</w:t>
-        </w:r>
-      </w:hyperlink>
-      <w:r>
-        <w:t xml:space="preserve"> — IBM · certificat de cours en ligne (Coursera)</w:t>
-      </w:r>
-      <w:r>
-        <w:t xml:space="preserve">	</w:t>
-      </w:r>
-      <w:r>
-        <w:rPr>
-          <w:color w:val="000000"/>
-          <w:sz w:val="19"/>
-          <w:szCs w:val="19"/>
-        </w:rPr>
-        <w:t xml:space="preserve">Novembre 2025</w:t>
-      </w:r>
-    </w:p>
-    <w:p>
-      <w:pPr>
-        <w:pBdr>
-          <w:bottom w:val="single" w:color="B5B5B5" w:sz="8" w:space="2"/>
-        </w:pBdr>
-        <w:spacing w:after="80" w:before="220"/>
-      </w:pPr>
-      <w:r>
-        <w:rPr>
-          <w:b/>
-          <w:bCs/>
-          <w:color w:val="000000"/>
-          <w:spacing w:val="15"/>
-          <w:sz w:val="21"/>
-          <w:szCs w:val="21"/>
-        </w:rPr>
-        <w:t xml:space="preserve">COMPÉTENCES TECHNIQUES ET LANGUES</w:t>
       </w:r>
     </w:p>
     <w:p>
@@ -837,14 +710,26 @@
         <w:spacing w:after="0" w:before="20"/>
       </w:pPr>
       <w:r>
-        <w:rPr>
-          <w:b/>
-          <w:bCs/>
-        </w:rPr>
-        <w:t xml:space="preserve">Sécurité applicative : </w:t>
-      </w:r>
-      <w:r>
-        <w:t xml:space="preserve">tests d'intrusion web, évaluation de vulnérabilités, OWASP, détection XSS (DAST)</w:t>
+        <w:t xml:space="preserve">Participé à 3 jours de simulation de crise (Cellule 3, pôle Continuité d'activité) : qualifier, décider et agir sous pression.</w:t>
+      </w:r>
+    </w:p>
+    <w:p>
+      <w:pPr>
+        <w:keepNext/>
+        <w:pBdr>
+          <w:bottom w:val="single" w:color="B5B5B5" w:sz="8" w:space="2"/>
+        </w:pBdr>
+        <w:spacing w:after="80" w:before="240"/>
+      </w:pPr>
+      <w:r>
+        <w:rPr>
+          <w:b/>
+          <w:bCs/>
+          <w:spacing w:val="15"/>
+          <w:sz w:val="21"/>
+          <w:szCs w:val="21"/>
+        </w:rPr>
+        <w:t xml:space="preserve">COMPÉTENCES TECHNIQUES ET LANGUES</w:t>
       </w:r>
     </w:p>
     <w:p>
@@ -861,10 +746,10 @@
           <w:b/>
           <w:bCs/>
         </w:rPr>
-        <w:t xml:space="preserve">Outils de sécurité : </w:t>
-      </w:r>
-      <w:r>
-        <w:t xml:space="preserve">Burp Suite, sqlmap, Wireshark, XSStrike, DalFox, Playwright</w:t>
+        <w:t xml:space="preserve">Sécurité applicative : </w:t>
+      </w:r>
+      <w:r>
+        <w:t xml:space="preserve">tests d'intrusion web, évaluation de vulnérabilités, OWASP, détection XSS (DAST)</w:t>
       </w:r>
     </w:p>
     <w:p>
@@ -881,10 +766,10 @@
           <w:b/>
           <w:bCs/>
         </w:rPr>
-        <w:t xml:space="preserve">Systèmes et réseaux : </w:t>
-      </w:r>
-      <w:r>
-        <w:t xml:space="preserve">Linux, sécurité réseau, durcissement des systèmes</w:t>
+        <w:t xml:space="preserve">Outils de sécurité : </w:t>
+      </w:r>
+      <w:r>
+        <w:t xml:space="preserve">Burp Suite, sqlmap, Wireshark, XSStrike, DalFox, Playwright</w:t>
       </w:r>
     </w:p>
     <w:p>
@@ -901,10 +786,10 @@
           <w:b/>
           <w:bCs/>
         </w:rPr>
-        <w:t xml:space="preserve">Déploiement et supervision : </w:t>
-      </w:r>
-      <w:r>
-        <w:t xml:space="preserve">Docker, Kubernetes, Git/GitHub, Prometheus, Grafana</w:t>
+        <w:t xml:space="preserve">Systèmes et réseaux : </w:t>
+      </w:r>
+      <w:r>
+        <w:t xml:space="preserve">Linux, sécurité réseau, durcissement des systèmes</w:t>
       </w:r>
     </w:p>
     <w:p>
@@ -921,10 +806,30 @@
           <w:b/>
           <w:bCs/>
         </w:rPr>
+        <w:t xml:space="preserve">Déploiement et supervision : </w:t>
+      </w:r>
+      <w:r>
+        <w:t xml:space="preserve">Docker, Kubernetes, Git/GitHub, Prometheus, Grafana</w:t>
+      </w:r>
+    </w:p>
+    <w:p>
+      <w:pPr>
+        <w:pStyle w:val="ListParagraph"/>
+        <w:numPr>
+          <w:ilvl w:val="0"/>
+          <w:numId w:val="2"/>
+        </w:numPr>
+        <w:spacing w:after="0" w:before="20"/>
+      </w:pPr>
+      <w:r>
+        <w:rPr>
+          <w:b/>
+          <w:bCs/>
+        </w:rPr>
         <w:t xml:space="preserve">Développement : </w:t>
       </w:r>
       <w:r>
-        <w:t xml:space="preserve">Python (FastAPI, Django), JavaScript (React, Node.js), Java, C++</w:t>
+        <w:t xml:space="preserve">Python (FastAPI, Django), JavaScript (React, Node.js)</w:t>
       </w:r>
     </w:p>
     <w:p>
@@ -1125,11 +1030,8 @@
       <w:lvlText w:val="•"/>
       <w:lvlJc w:val="left"/>
       <w:pPr>
-        <w:ind w:left="200" w:hanging="160"/>
-      </w:pPr>
-      <w:rPr>
-        <w:color w:val="000000"/>
-      </w:rPr>
+        <w:ind w:left="240" w:hanging="200"/>
+      </w:pPr>
     </w:lvl>
   </w:abstractNum>
   <w:num w:numId="1">

</xml_diff>

<commit_message>
Add PortSwigger Web Security Academy training to CV skills
Co-Authored-By: Claude Opus 5.5 <noreply@anthropic.com>
</commit_message>
<xml_diff>
--- a/assets/cv/CV.docx
+++ b/assets/cv/CV.docx
@@ -62,7 +62,7 @@
         </w:rPr>
         <w:t xml:space="preserve">   ·   </w:t>
       </w:r>
-      <w:hyperlink w:history="1" r:id="rId4tk-qxvsdshlnjjjnrg9h">
+      <w:hyperlink w:history="1" r:id="rIdyqlozsw5lwapisb2g-ry5">
         <w:r>
           <w:rPr>
             <w:color w:val="000000"/>
@@ -84,7 +84,7 @@
         </w:rPr>
         <w:t xml:space="preserve">Portfolio : </w:t>
       </w:r>
-      <w:hyperlink w:history="1" r:id="rIdylh7kx-bdvpula5wo5ox4">
+      <w:hyperlink w:history="1" r:id="rIdygdyo8gheyx3nbgujvp4k">
         <w:r>
           <w:rPr>
             <w:color w:val="000000"/>
@@ -108,7 +108,7 @@
         </w:rPr>
         <w:t xml:space="preserve">GitHub : </w:t>
       </w:r>
-      <w:hyperlink w:history="1" r:id="rIdj8ogfq0vb0rq1_1-tgfei">
+      <w:hyperlink w:history="1" r:id="rId8utemahatlh8rjburjzfm">
         <w:r>
           <w:rPr>
             <w:color w:val="000000"/>
@@ -132,7 +132,7 @@
         </w:rPr>
         <w:t xml:space="preserve">LinkedIn : </w:t>
       </w:r>
-      <w:hyperlink w:history="1" r:id="rId12waskvslau2h3ewvzcng">
+      <w:hyperlink w:history="1" r:id="rIds9em3umsi4pmwdyf7krt1">
         <w:r>
           <w:rPr>
             <w:color w:val="000000"/>
@@ -518,7 +518,7 @@
         </w:tabs>
         <w:spacing w:after="20" w:before="0"/>
       </w:pPr>
-      <w:hyperlink w:history="1" r:id="rIdw7gzwrxc4dgqtlvq2r7pk">
+      <w:hyperlink w:history="1" r:id="rIdynujld314b_5479glq-rl">
         <w:r>
           <w:rPr>
             <w:b/>
@@ -561,7 +561,7 @@
         </w:tabs>
         <w:spacing w:after="20" w:before="50"/>
       </w:pPr>
-      <w:hyperlink w:history="1" r:id="rIdfuwclhsn_l8jg-sext5vu">
+      <w:hyperlink w:history="1" r:id="rIdkfc8x7lzyzgvifi6lm47k">
         <w:r>
           <w:rPr>
             <w:b/>
@@ -593,7 +593,7 @@
         </w:tabs>
         <w:spacing w:after="20" w:before="50"/>
       </w:pPr>
-      <w:hyperlink w:history="1" r:id="rIdpkrxyu99tqzekqslvo336">
+      <w:hyperlink w:history="1" r:id="rId3eeo7g_ypcgdgp1xkzhev">
         <w:r>
           <w:rPr>
             <w:b/>
@@ -625,7 +625,7 @@
         </w:tabs>
         <w:spacing w:after="20" w:before="50"/>
       </w:pPr>
-      <w:hyperlink w:history="1" r:id="rIdckvuscvbvko91--_dbszj">
+      <w:hyperlink w:history="1" r:id="rId3tvo3ani631daxz3yh3ma">
         <w:r>
           <w:rPr>
             <w:b/>
@@ -676,7 +676,7 @@
         </w:tabs>
         <w:spacing w:after="20" w:before="0"/>
       </w:pPr>
-      <w:hyperlink w:history="1" r:id="rIdrmi0dfd01l2r_wkxewzcg">
+      <w:hyperlink w:history="1" r:id="rIdi-6kyw3iqa9w16elwbc9u">
         <w:r>
           <w:rPr>
             <w:b/>
@@ -770,6 +770,26 @@
       </w:r>
       <w:r>
         <w:t xml:space="preserve">Burp Suite, sqlmap, Wireshark, XSStrike, DalFox, Playwright</w:t>
+      </w:r>
+    </w:p>
+    <w:p>
+      <w:pPr>
+        <w:pStyle w:val="ListParagraph"/>
+        <w:numPr>
+          <w:ilvl w:val="0"/>
+          <w:numId w:val="2"/>
+        </w:numPr>
+        <w:spacing w:after="0" w:before="20"/>
+      </w:pPr>
+      <w:r>
+        <w:rPr>
+          <w:b/>
+          <w:bCs/>
+        </w:rPr>
+        <w:t xml:space="preserve">Entraînement : </w:t>
+      </w:r>
+      <w:r>
+        <w:t xml:space="preserve">PortSwigger Web Security Academy (en cours)</w:t>
       </w:r>
     </w:p>
     <w:p>

</xml_diff>

<commit_message>
Align portfolio wording with CV and link Coursera verifications
Portfolio now describes a cybersecurity engineering student and a systems
monitoring project (no threat-detection claim); CV course certificates link
to their official Coursera verification pages.

Co-Authored-By: Claude Opus 5.5 <noreply@anthropic.com>
</commit_message>
<xml_diff>
--- a/assets/cv/CV.docx
+++ b/assets/cv/CV.docx
@@ -62,7 +62,7 @@
         </w:rPr>
         <w:t xml:space="preserve">   ·   </w:t>
       </w:r>
-      <w:hyperlink w:history="1" r:id="rIdyqlozsw5lwapisb2g-ry5">
+      <w:hyperlink w:history="1" r:id="rIdtxegkwyygfwtbus-tl3m2">
         <w:r>
           <w:rPr>
             <w:color w:val="000000"/>
@@ -84,7 +84,7 @@
         </w:rPr>
         <w:t xml:space="preserve">Portfolio : </w:t>
       </w:r>
-      <w:hyperlink w:history="1" r:id="rIdygdyo8gheyx3nbgujvp4k">
+      <w:hyperlink w:history="1" r:id="rId4mzmxpxzxjdzdpyn2xv_x">
         <w:r>
           <w:rPr>
             <w:color w:val="000000"/>
@@ -108,7 +108,7 @@
         </w:rPr>
         <w:t xml:space="preserve">GitHub : </w:t>
       </w:r>
-      <w:hyperlink w:history="1" r:id="rId8utemahatlh8rjburjzfm">
+      <w:hyperlink w:history="1" r:id="rIdxdojv-fjyvvechhnx2wr1">
         <w:r>
           <w:rPr>
             <w:color w:val="000000"/>
@@ -132,7 +132,7 @@
         </w:rPr>
         <w:t xml:space="preserve">LinkedIn : </w:t>
       </w:r>
-      <w:hyperlink w:history="1" r:id="rIds9em3umsi4pmwdyf7krt1">
+      <w:hyperlink w:history="1" r:id="rId3c9gvsdxx5k-iovwlvrll">
         <w:r>
           <w:rPr>
             <w:color w:val="000000"/>
@@ -518,7 +518,7 @@
         </w:tabs>
         <w:spacing w:after="20" w:before="0"/>
       </w:pPr>
-      <w:hyperlink w:history="1" r:id="rIdynujld314b_5479glq-rl">
+      <w:hyperlink w:history="1" r:id="rIdc0usd5t_5tfymx3jldx6f">
         <w:r>
           <w:rPr>
             <w:b/>
@@ -561,7 +561,7 @@
         </w:tabs>
         <w:spacing w:after="20" w:before="50"/>
       </w:pPr>
-      <w:hyperlink w:history="1" r:id="rIdkfc8x7lzyzgvifi6lm47k">
+      <w:hyperlink w:history="1" r:id="rIdfiloeyvfektpnzb6w8rgg">
         <w:r>
           <w:rPr>
             <w:b/>
@@ -593,7 +593,7 @@
         </w:tabs>
         <w:spacing w:after="20" w:before="50"/>
       </w:pPr>
-      <w:hyperlink w:history="1" r:id="rId3eeo7g_ypcgdgp1xkzhev">
+      <w:hyperlink w:history="1" r:id="rIdz_pmf9vmhnznetljbqvpu">
         <w:r>
           <w:rPr>
             <w:b/>
@@ -625,7 +625,7 @@
         </w:tabs>
         <w:spacing w:after="20" w:before="50"/>
       </w:pPr>
-      <w:hyperlink w:history="1" r:id="rId3tvo3ani631daxz3yh3ma">
+      <w:hyperlink w:history="1" r:id="rIddkdraq5e2xf5rkldvqj7a">
         <w:r>
           <w:rPr>
             <w:b/>
@@ -676,7 +676,7 @@
         </w:tabs>
         <w:spacing w:after="20" w:before="0"/>
       </w:pPr>
-      <w:hyperlink w:history="1" r:id="rIdi-6kyw3iqa9w16elwbc9u">
+      <w:hyperlink w:history="1" r:id="rIdvvx-wv1otv9ttauni5yh0">
         <w:r>
           <w:rPr>
             <w:b/>

</xml_diff>

<commit_message>
Broaden CV profile, rebalance internships and expand security tooling
Restore baccalauréat, add AWS Fargate to the YZY internship, add the
in-progress Cisco Ethical Hacker course and the confirmed pentest/DevSecOps tools.

Co-Authored-By: Claude Opus 5.5 <noreply@anthropic.com>
</commit_message>
<xml_diff>
--- a/assets/cv/CV.docx
+++ b/assets/cv/CV.docx
@@ -62,7 +62,7 @@
         </w:rPr>
         <w:t xml:space="preserve">   ·   </w:t>
       </w:r>
-      <w:hyperlink w:history="1" r:id="rIdtxegkwyygfwtbus-tl3m2">
+      <w:hyperlink w:history="1" r:id="rIdgdoygq4udzkgpugxq-5hb">
         <w:r>
           <w:rPr>
             <w:color w:val="000000"/>
@@ -84,7 +84,7 @@
         </w:rPr>
         <w:t xml:space="preserve">Portfolio : </w:t>
       </w:r>
-      <w:hyperlink w:history="1" r:id="rId4mzmxpxzxjdzdpyn2xv_x">
+      <w:hyperlink w:history="1" r:id="rIddd4lnxhsqo9cqbihrggyf">
         <w:r>
           <w:rPr>
             <w:color w:val="000000"/>
@@ -108,7 +108,7 @@
         </w:rPr>
         <w:t xml:space="preserve">GitHub : </w:t>
       </w:r>
-      <w:hyperlink w:history="1" r:id="rIdxdojv-fjyvvechhnx2wr1">
+      <w:hyperlink w:history="1" r:id="rId0zgrlbxfzjddnw7tybaiz">
         <w:r>
           <w:rPr>
             <w:color w:val="000000"/>
@@ -132,7 +132,7 @@
         </w:rPr>
         <w:t xml:space="preserve">LinkedIn : </w:t>
       </w:r>
-      <w:hyperlink w:history="1" r:id="rId3c9gvsdxx5k-iovwlvrll">
+      <w:hyperlink w:history="1" r:id="rIdk8e5djb8n_pdljglut1sf">
         <w:r>
           <w:rPr>
             <w:color w:val="000000"/>
@@ -149,7 +149,7 @@
         <w:pBdr>
           <w:bottom w:val="single" w:color="B5B5B5" w:sz="8" w:space="2"/>
         </w:pBdr>
-        <w:spacing w:after="80" w:before="240"/>
+        <w:spacing w:after="70" w:before="170"/>
       </w:pPr>
       <w:r>
         <w:rPr>
@@ -164,7 +164,7 @@
     </w:p>
     <w:p>
       <w:r>
-        <w:t xml:space="preserve">Élève ingénieur en 5ᵉ année de cybersécurité à l'EMSI Rabat. J'ai conçu un pipeline automatisé de détection des vulnérabilités XSS (DAST), déployé une application sur Kubernetes dans le cloud et mis en place une supervision Prometheus/Grafana. Je recherche un stage de fin d'études (PFE) en 2027 en sécurité applicative, tests d'intrusion ou DevSecOps.</w:t>
+        <w:t xml:space="preserve">Élève ingénieur en 5ᵉ année de cybersécurité à l'EMSI Rabat, orienté tests d'intrusion et sécurité web. Pratique de l'évaluation de vulnérabilités, des outils offensifs (Burp Suite, Metasploit, Nmap), de l'automatisation des tests (DAST) et du déploiement DevSecOps. Recherche un stage de fin d'études (PFE) en 2027 en tests d'intrusion, sécurité applicative ou DevSecOps.</w:t>
       </w:r>
     </w:p>
     <w:p>
@@ -173,7 +173,7 @@
         <w:pBdr>
           <w:bottom w:val="single" w:color="B5B5B5" w:sz="8" w:space="2"/>
         </w:pBdr>
-        <w:spacing w:after="80" w:before="240"/>
+        <w:spacing w:after="70" w:before="170"/>
       </w:pPr>
       <w:r>
         <w:rPr>
@@ -218,10 +218,39 @@
     <w:p>
       <w:pPr>
         <w:keepNext/>
+        <w:tabs>
+          <w:tab w:val="right" w:pos="10206"/>
+        </w:tabs>
+        <w:spacing w:after="20" w:before="100"/>
+      </w:pPr>
+      <w:r>
+        <w:rPr>
+          <w:b/>
+          <w:bCs/>
+        </w:rPr>
+        <w:t xml:space="preserve">Baccalauréat Sciences physiques et chimiques</w:t>
+      </w:r>
+      <w:r>
+        <w:t xml:space="preserve"> · Lycée Al-Ghazali, Témara</w:t>
+      </w:r>
+      <w:r>
+        <w:t xml:space="preserve">	</w:t>
+      </w:r>
+      <w:r>
+        <w:rPr>
+          <w:sz w:val="19"/>
+          <w:szCs w:val="19"/>
+        </w:rPr>
+        <w:t xml:space="preserve">2022</w:t>
+      </w:r>
+    </w:p>
+    <w:p>
+      <w:pPr>
+        <w:keepNext/>
         <w:pBdr>
           <w:bottom w:val="single" w:color="B5B5B5" w:sz="8" w:space="2"/>
         </w:pBdr>
-        <w:spacing w:after="80" w:before="240"/>
+        <w:spacing w:after="70" w:before="170"/>
       </w:pPr>
       <w:r>
         <w:rPr>
@@ -286,17 +315,7 @@
         <w:spacing w:after="0" w:before="20"/>
       </w:pPr>
       <w:r>
-        <w:t xml:space="preserve">Orchestré un crawler Playwright (URL, formulaires, </w:t>
-      </w:r>
-      <w:r>
-        <w:rPr>
-          <w:i/>
-          <w:iCs/>
-        </w:rPr>
-        <w:t xml:space="preserve">sinks</w:t>
-      </w:r>
-      <w:r>
-        <w:t xml:space="preserve"> DOM-XSS) et XSStrike/DalFox en conteneurs Docker isolés.</w:t>
+        <w:t xml:space="preserve">Orchestré un crawler Playwright et les scanners XSStrike/DalFox dans des conteneurs Docker isolés.</w:t>
       </w:r>
     </w:p>
     <w:p>
@@ -309,7 +328,57 @@
         <w:spacing w:after="0" w:before="20"/>
       </w:pPr>
       <w:r>
-        <w:t xml:space="preserve">Normalisé et dédupliqué les résultats des deux scanners ; généré automatiquement des rapports HTML et PDF.</w:t>
+        <w:t xml:space="preserve">Validé l'outil sur une cible autorisée (OWASP Juice Shop) ; rapports HTML et PDF générés automatiquement.</w:t>
+      </w:r>
+    </w:p>
+    <w:p>
+      <w:pPr>
+        <w:spacing w:after="0" w:before="30"/>
+      </w:pPr>
+      <w:r>
+        <w:rPr>
+          <w:b/>
+          <w:bCs/>
+          <w:sz w:val="19"/>
+          <w:szCs w:val="19"/>
+        </w:rPr>
+        <w:t xml:space="preserve">Environnement : </w:t>
+      </w:r>
+      <w:r>
+        <w:rPr>
+          <w:sz w:val="19"/>
+          <w:szCs w:val="19"/>
+        </w:rPr>
+        <w:t xml:space="preserve">Python, FastAPI, Playwright, XSStrike, DalFox, Docker, Jinja2, ReportLab</w:t>
+      </w:r>
+    </w:p>
+    <w:p>
+      <w:pPr>
+        <w:keepNext/>
+        <w:tabs>
+          <w:tab w:val="right" w:pos="10206"/>
+        </w:tabs>
+        <w:spacing w:after="20" w:before="100"/>
+      </w:pPr>
+      <w:r>
+        <w:rPr>
+          <w:b/>
+          <w:bCs/>
+        </w:rPr>
+        <w:t xml:space="preserve">YZY Digital Technologies</w:t>
+      </w:r>
+      <w:r>
+        <w:t xml:space="preserve"> — Stage d'été : déploiement cloud et DevSecOps</w:t>
+      </w:r>
+      <w:r>
+        <w:t xml:space="preserve">	</w:t>
+      </w:r>
+      <w:r>
+        <w:rPr>
+          <w:sz w:val="19"/>
+          <w:szCs w:val="19"/>
+        </w:rPr>
+        <w:t xml:space="preserve">Juillet – septembre 2025</w:t>
       </w:r>
     </w:p>
     <w:p>
@@ -322,57 +391,7 @@
         <w:spacing w:after="0" w:before="20"/>
       </w:pPr>
       <w:r>
-        <w:t xml:space="preserve">Validé l'outil sur une cible autorisée (OWASP Juice Shop en local).</w:t>
-      </w:r>
-    </w:p>
-    <w:p>
-      <w:pPr>
-        <w:spacing w:after="0" w:before="30"/>
-      </w:pPr>
-      <w:r>
-        <w:rPr>
-          <w:b/>
-          <w:bCs/>
-          <w:sz w:val="19"/>
-          <w:szCs w:val="19"/>
-        </w:rPr>
-        <w:t xml:space="preserve">Environnement : </w:t>
-      </w:r>
-      <w:r>
-        <w:rPr>
-          <w:sz w:val="19"/>
-          <w:szCs w:val="19"/>
-        </w:rPr>
-        <w:t xml:space="preserve">Python, FastAPI, Playwright, XSStrike, DalFox, Docker, Jinja2, ReportLab</w:t>
-      </w:r>
-    </w:p>
-    <w:p>
-      <w:pPr>
-        <w:keepNext/>
-        <w:tabs>
-          <w:tab w:val="right" w:pos="10206"/>
-        </w:tabs>
-        <w:spacing w:after="20" w:before="100"/>
-      </w:pPr>
-      <w:r>
-        <w:rPr>
-          <w:b/>
-          <w:bCs/>
-        </w:rPr>
-        <w:t xml:space="preserve">YZY Digital Technologies</w:t>
-      </w:r>
-      <w:r>
-        <w:t xml:space="preserve"> — Stage d'été : déploiement cloud et DevSecOps</w:t>
-      </w:r>
-      <w:r>
-        <w:t xml:space="preserve">	</w:t>
-      </w:r>
-      <w:r>
-        <w:rPr>
-          <w:sz w:val="19"/>
-          <w:szCs w:val="19"/>
-        </w:rPr>
-        <w:t xml:space="preserve">Juillet – septembre 2025</w:t>
+        <w:t xml:space="preserve">Conteneurisé une application avec Docker en vue de son déploiement sur AWS.</w:t>
       </w:r>
     </w:p>
     <w:p>
@@ -385,7 +404,28 @@
         <w:spacing w:after="0" w:before="20"/>
       </w:pPr>
       <w:r>
-        <w:t xml:space="preserve">Conteneurisé une application avec Docker et réalisé son déploiement sur Kubernetes dans le cloud.</w:t>
+        <w:t xml:space="preserve">Déployé l'application sur Kubernetes avec AWS Fargate (serverless), selon les pratiques DevSecOps.</w:t>
+      </w:r>
+    </w:p>
+    <w:p>
+      <w:pPr>
+        <w:spacing w:after="0" w:before="30"/>
+      </w:pPr>
+      <w:r>
+        <w:rPr>
+          <w:b/>
+          <w:bCs/>
+          <w:sz w:val="19"/>
+          <w:szCs w:val="19"/>
+        </w:rPr>
+        <w:t xml:space="preserve">Environnement : </w:t>
+      </w:r>
+      <w:r>
+        <w:rPr>
+          <w:sz w:val="19"/>
+          <w:szCs w:val="19"/>
+        </w:rPr>
+        <w:t xml:space="preserve">Docker, Kubernetes, AWS Fargate</w:t>
       </w:r>
     </w:p>
     <w:p>
@@ -394,7 +434,7 @@
         <w:pBdr>
           <w:bottom w:val="single" w:color="B5B5B5" w:sz="8" w:space="2"/>
         </w:pBdr>
-        <w:spacing w:after="80" w:before="240"/>
+        <w:spacing w:after="70" w:before="170"/>
       </w:pPr>
       <w:r>
         <w:rPr>
@@ -446,7 +486,7 @@
         <w:spacing w:after="0" w:before="20"/>
       </w:pPr>
       <w:r>
-        <w:t xml:space="preserve">Mis en place une supervision Node Exporter, Prometheus et Grafana (mémoire, trafic réseau, espace disque) dans une approche de sécurité défensive.</w:t>
+        <w:t xml:space="preserve">Mis en place une supervision Node Exporter, Prometheus et Grafana (mémoire, réseau, disque), approche défensive.</w:t>
       </w:r>
     </w:p>
     <w:p>
@@ -497,7 +537,7 @@
         <w:pBdr>
           <w:bottom w:val="single" w:color="B5B5B5" w:sz="8" w:space="2"/>
         </w:pBdr>
-        <w:spacing w:after="80" w:before="240"/>
+        <w:spacing w:after="70" w:before="170"/>
       </w:pPr>
       <w:r>
         <w:rPr>
@@ -518,7 +558,7 @@
         </w:tabs>
         <w:spacing w:after="20" w:before="0"/>
       </w:pPr>
-      <w:hyperlink w:history="1" r:id="rIdc0usd5t_5tfymx3jldx6f">
+      <w:hyperlink w:history="1" r:id="rIdthnz9fulng82qiqqpqy5p">
         <w:r>
           <w:rPr>
             <w:b/>
@@ -561,7 +601,36 @@
         </w:tabs>
         <w:spacing w:after="20" w:before="50"/>
       </w:pPr>
-      <w:hyperlink w:history="1" r:id="rIdfiloeyvfektpnzb6w8rgg">
+      <w:r>
+        <w:rPr>
+          <w:b/>
+          <w:bCs/>
+        </w:rPr>
+        <w:t xml:space="preserve">Ethical Hacker</w:t>
+      </w:r>
+      <w:r>
+        <w:t xml:space="preserve"> — Cisco Networking Academy · formation</w:t>
+      </w:r>
+      <w:r>
+        <w:t xml:space="preserve">	</w:t>
+      </w:r>
+      <w:r>
+        <w:rPr>
+          <w:sz w:val="19"/>
+          <w:szCs w:val="19"/>
+        </w:rPr>
+        <w:t xml:space="preserve">En cours</w:t>
+      </w:r>
+    </w:p>
+    <w:p>
+      <w:pPr>
+        <w:keepNext/>
+        <w:tabs>
+          <w:tab w:val="right" w:pos="10206"/>
+        </w:tabs>
+        <w:spacing w:after="20" w:before="50"/>
+      </w:pPr>
+      <w:hyperlink w:history="1" r:id="rIdn0ug1mzwwq06lux7icjfa">
         <w:r>
           <w:rPr>
             <w:b/>
@@ -593,7 +662,7 @@
         </w:tabs>
         <w:spacing w:after="20" w:before="50"/>
       </w:pPr>
-      <w:hyperlink w:history="1" r:id="rIdz_pmf9vmhnznetljbqvpu">
+      <w:hyperlink w:history="1" r:id="rIdosr5tomiccanpy4h-g5nv">
         <w:r>
           <w:rPr>
             <w:b/>
@@ -625,7 +694,7 @@
         </w:tabs>
         <w:spacing w:after="20" w:before="50"/>
       </w:pPr>
-      <w:hyperlink w:history="1" r:id="rIddkdraq5e2xf5rkldvqj7a">
+      <w:hyperlink w:history="1" r:id="rIdlrc78nmqjm1imjuoedjck">
         <w:r>
           <w:rPr>
             <w:b/>
@@ -655,7 +724,7 @@
         <w:pBdr>
           <w:bottom w:val="single" w:color="B5B5B5" w:sz="8" w:space="2"/>
         </w:pBdr>
-        <w:spacing w:after="80" w:before="240"/>
+        <w:spacing w:after="70" w:before="170"/>
       </w:pPr>
       <w:r>
         <w:rPr>
@@ -676,7 +745,7 @@
         </w:tabs>
         <w:spacing w:after="20" w:before="0"/>
       </w:pPr>
-      <w:hyperlink w:history="1" r:id="rIdvvx-wv1otv9ttauni5yh0">
+      <w:hyperlink w:history="1" r:id="rIdhty9bbhiak0rvoqrrjzfv">
         <w:r>
           <w:rPr>
             <w:b/>
@@ -719,7 +788,7 @@
         <w:pBdr>
           <w:bottom w:val="single" w:color="B5B5B5" w:sz="8" w:space="2"/>
         </w:pBdr>
-        <w:spacing w:after="80" w:before="240"/>
+        <w:spacing w:after="70" w:before="170"/>
       </w:pPr>
       <w:r>
         <w:rPr>
@@ -766,10 +835,10 @@
           <w:b/>
           <w:bCs/>
         </w:rPr>
-        <w:t xml:space="preserve">Outils de sécurité : </w:t>
-      </w:r>
-      <w:r>
-        <w:t xml:space="preserve">Burp Suite, sqlmap, Wireshark, XSStrike, DalFox, Playwright</w:t>
+        <w:t xml:space="preserve">Tests d'intrusion : </w:t>
+      </w:r>
+      <w:r>
+        <w:t xml:space="preserve">Burp Suite, OWASP ZAP, Metasploit, sqlmap, Nmap, Nikto, Gobuster/ffuf, Hydra, John/Hashcat</w:t>
       </w:r>
     </w:p>
     <w:p>
@@ -786,10 +855,10 @@
           <w:b/>
           <w:bCs/>
         </w:rPr>
-        <w:t xml:space="preserve">Entraînement : </w:t>
-      </w:r>
-      <w:r>
-        <w:t xml:space="preserve">PortSwigger Web Security Academy (en cours)</w:t>
+        <w:t xml:space="preserve">Analyse et automatisation : </w:t>
+      </w:r>
+      <w:r>
+        <w:t xml:space="preserve">Wireshark, XSStrike, DalFox, Playwright</w:t>
       </w:r>
     </w:p>
     <w:p>
@@ -806,10 +875,10 @@
           <w:b/>
           <w:bCs/>
         </w:rPr>
-        <w:t xml:space="preserve">Systèmes et réseaux : </w:t>
-      </w:r>
-      <w:r>
-        <w:t xml:space="preserve">Linux, sécurité réseau, durcissement des systèmes</w:t>
+        <w:t xml:space="preserve">Entraînement : </w:t>
+      </w:r>
+      <w:r>
+        <w:t xml:space="preserve">PortSwigger Web Security Academy (en cours)</w:t>
       </w:r>
     </w:p>
     <w:p>
@@ -826,10 +895,30 @@
           <w:b/>
           <w:bCs/>
         </w:rPr>
-        <w:t xml:space="preserve">Déploiement et supervision : </w:t>
-      </w:r>
-      <w:r>
-        <w:t xml:space="preserve">Docker, Kubernetes, Git/GitHub, Prometheus, Grafana</w:t>
+        <w:t xml:space="preserve">Systèmes et supervision : </w:t>
+      </w:r>
+      <w:r>
+        <w:t xml:space="preserve">Kali Linux, Linux, Prometheus, Grafana, sécurité réseau, durcissement des systèmes</w:t>
+      </w:r>
+    </w:p>
+    <w:p>
+      <w:pPr>
+        <w:pStyle w:val="ListParagraph"/>
+        <w:numPr>
+          <w:ilvl w:val="0"/>
+          <w:numId w:val="2"/>
+        </w:numPr>
+        <w:spacing w:after="0" w:before="20"/>
+      </w:pPr>
+      <w:r>
+        <w:rPr>
+          <w:b/>
+          <w:bCs/>
+        </w:rPr>
+        <w:t xml:space="preserve">Cloud et DevSecOps : </w:t>
+      </w:r>
+      <w:r>
+        <w:t xml:space="preserve">Docker, Kubernetes, AWS Fargate, GitHub Actions/GitLab CI, SonarQube, Git</w:t>
       </w:r>
     </w:p>
     <w:p>

</xml_diff>

<commit_message>
Add Money Manager and Solo Leveling System projects and Google cybersecurity certificate
Co-Authored-By: Claude Opus 5.5 <noreply@anthropic.com>
</commit_message>
<xml_diff>
--- a/assets/cv/CV.docx
+++ b/assets/cv/CV.docx
@@ -62,7 +62,7 @@
         </w:rPr>
         <w:t xml:space="preserve">   ·   </w:t>
       </w:r>
-      <w:hyperlink w:history="1" r:id="rIdgdoygq4udzkgpugxq-5hb">
+      <w:hyperlink w:history="1" r:id="rIdn-9rslmyfika1vgagbgat">
         <w:r>
           <w:rPr>
             <w:color w:val="000000"/>
@@ -84,7 +84,7 @@
         </w:rPr>
         <w:t xml:space="preserve">Portfolio : </w:t>
       </w:r>
-      <w:hyperlink w:history="1" r:id="rIddd4lnxhsqo9cqbihrggyf">
+      <w:hyperlink w:history="1" r:id="rIdi-jhru7zrzvpicwppufuu">
         <w:r>
           <w:rPr>
             <w:color w:val="000000"/>
@@ -108,7 +108,7 @@
         </w:rPr>
         <w:t xml:space="preserve">GitHub : </w:t>
       </w:r>
-      <w:hyperlink w:history="1" r:id="rId0zgrlbxfzjddnw7tybaiz">
+      <w:hyperlink w:history="1" r:id="rIdfazbddq9y_89051vj1j44">
         <w:r>
           <w:rPr>
             <w:color w:val="000000"/>
@@ -132,7 +132,7 @@
         </w:rPr>
         <w:t xml:space="preserve">LinkedIn : </w:t>
       </w:r>
-      <w:hyperlink w:history="1" r:id="rIdk8e5djb8n_pdljglut1sf">
+      <w:hyperlink w:history="1" r:id="rIdgul1595wmc77lma1zw7ku">
         <w:r>
           <w:rPr>
             <w:color w:val="000000"/>
@@ -558,7 +558,7 @@
         </w:tabs>
         <w:spacing w:after="20" w:before="0"/>
       </w:pPr>
-      <w:hyperlink w:history="1" r:id="rIdthnz9fulng82qiqqpqy5p">
+      <w:hyperlink w:history="1" r:id="rIdnamutuygdsvgi76iszgjb">
         <w:r>
           <w:rPr>
             <w:b/>
@@ -599,17 +599,20 @@
         <w:tabs>
           <w:tab w:val="right" w:pos="10206"/>
         </w:tabs>
-        <w:spacing w:after="20" w:before="50"/>
-      </w:pPr>
-      <w:r>
-        <w:rPr>
-          <w:b/>
-          <w:bCs/>
-        </w:rPr>
-        <w:t xml:space="preserve">Ethical Hacker</w:t>
-      </w:r>
-      <w:r>
-        <w:t xml:space="preserve"> — Cisco Networking Academy · formation</w:t>
+        <w:spacing w:after="20" w:before="30"/>
+      </w:pPr>
+      <w:hyperlink w:history="1" r:id="rIdz66p2blucy7hlggo2h-2g">
+        <w:r>
+          <w:rPr>
+            <w:b/>
+            <w:bCs/>
+            <w:color w:val="000000"/>
+          </w:rPr>
+          <w:t xml:space="preserve">Foundations of Cybersecurity</w:t>
+        </w:r>
+      </w:hyperlink>
+      <w:r>
+        <w:t xml:space="preserve"> — Google · certificat de cours en ligne (Coursera)</w:t>
       </w:r>
       <w:r>
         <w:t xml:space="preserve">	</w:t>
@@ -619,7 +622,7 @@
           <w:sz w:val="19"/>
           <w:szCs w:val="19"/>
         </w:rPr>
-        <w:t xml:space="preserve">En cours</w:t>
+        <w:t xml:space="preserve">Octobre 2026</w:t>
       </w:r>
     </w:p>
     <w:p>
@@ -628,9 +631,38 @@
         <w:tabs>
           <w:tab w:val="right" w:pos="10206"/>
         </w:tabs>
-        <w:spacing w:after="20" w:before="50"/>
-      </w:pPr>
-      <w:hyperlink w:history="1" r:id="rIdn0ug1mzwwq06lux7icjfa">
+        <w:spacing w:after="20" w:before="30"/>
+      </w:pPr>
+      <w:r>
+        <w:rPr>
+          <w:b/>
+          <w:bCs/>
+        </w:rPr>
+        <w:t xml:space="preserve">Ethical Hacker</w:t>
+      </w:r>
+      <w:r>
+        <w:t xml:space="preserve"> — Cisco Networking Academy · formation</w:t>
+      </w:r>
+      <w:r>
+        <w:t xml:space="preserve">	</w:t>
+      </w:r>
+      <w:r>
+        <w:rPr>
+          <w:sz w:val="19"/>
+          <w:szCs w:val="19"/>
+        </w:rPr>
+        <w:t xml:space="preserve">En cours</w:t>
+      </w:r>
+    </w:p>
+    <w:p>
+      <w:pPr>
+        <w:keepNext/>
+        <w:tabs>
+          <w:tab w:val="right" w:pos="10206"/>
+        </w:tabs>
+        <w:spacing w:after="20" w:before="30"/>
+      </w:pPr>
+      <w:hyperlink w:history="1" r:id="rId7-2hqzhbusxegc_ur3ms2">
         <w:r>
           <w:rPr>
             <w:b/>
@@ -660,9 +692,9 @@
         <w:tabs>
           <w:tab w:val="right" w:pos="10206"/>
         </w:tabs>
-        <w:spacing w:after="20" w:before="50"/>
-      </w:pPr>
-      <w:hyperlink w:history="1" r:id="rIdosr5tomiccanpy4h-g5nv">
+        <w:spacing w:after="20" w:before="30"/>
+      </w:pPr>
+      <w:hyperlink w:history="1" r:id="rIdmzgphfsnuproc_le2yim1">
         <w:r>
           <w:rPr>
             <w:b/>
@@ -692,9 +724,9 @@
         <w:tabs>
           <w:tab w:val="right" w:pos="10206"/>
         </w:tabs>
-        <w:spacing w:after="20" w:before="50"/>
-      </w:pPr>
-      <w:hyperlink w:history="1" r:id="rIdlrc78nmqjm1imjuoedjck">
+        <w:spacing w:after="20" w:before="30"/>
+      </w:pPr>
+      <w:hyperlink w:history="1" r:id="rIdbxlnhy5wzgow2e9by79tn">
         <w:r>
           <w:rPr>
             <w:b/>
@@ -745,7 +777,7 @@
         </w:tabs>
         <w:spacing w:after="20" w:before="0"/>
       </w:pPr>
-      <w:hyperlink w:history="1" r:id="rIdhty9bbhiak0rvoqrrjzfv">
+      <w:hyperlink w:history="1" r:id="rIdysz-bppts0ycg1ws5j_he">
         <w:r>
           <w:rPr>
             <w:b/>
@@ -963,7 +995,7 @@
     </w:p>
     <w:sectPr>
       <w:pgSz w:w="11906" w:h="16838" w:orient="portrait"/>
-      <w:pgMar w:top="737" w:right="850" w:bottom="624" w:left="850" w:header="0" w:footer="0" w:gutter="0"/>
+      <w:pgMar w:top="680" w:right="850" w:bottom="624" w:left="850" w:header="0" w:footer="0" w:gutter="0"/>
       <w:pgNumType/>
       <w:docGrid w:linePitch="360"/>
     </w:sectPr>
@@ -1172,7 +1204,7 @@
     </w:rPrDefault>
     <w:pPrDefault>
       <w:pPr>
-        <w:spacing w:after="0" w:line="252"/>
+        <w:spacing w:after="0" w:line="246"/>
       </w:pPr>
     </w:pPrDefault>
   </w:docDefaults>

</xml_diff>

<commit_message>
Update CV photo and content, add portfolio QR code
New profile photo; remove location line; pluralize FR headings; expand YZY
(Ansible, Jenkins, SonarQube) and phishing lab (GoPhish, Mailpit) tooling;
add WireGuard/Wireshark and TryHackMe; add a scannable portfolio QR bottom-right.

Co-Authored-By: Claude Opus 4.8 <noreply@anthropic.com>
</commit_message>
<xml_diff>
--- a/assets/cv/CV.docx
+++ b/assets/cv/CV.docx
@@ -15,6 +15,54 @@
         </w:rPr>
         <w:t xml:space="preserve">Walid Benhachimi</w:t>
       </w:r>
+      <w:r>
+        <w:drawing>
+          <wp:anchor distT="0" distB="0" distL="0" distR="0" simplePos="0" allowOverlap="1" behindDoc="0" locked="0" layoutInCell="1" relativeHeight="695325">
+            <wp:simplePos x="0" y="0"/>
+            <wp:positionH relativeFrom="page">
+              <wp:posOffset>6444000</wp:posOffset>
+            </wp:positionH>
+            <wp:positionV relativeFrom="page">
+              <wp:posOffset>9669600</wp:posOffset>
+            </wp:positionV>
+            <wp:extent cx="609600" cy="695325"/>
+            <wp:effectExtent t="0" r="0" b="0" l="0"/>
+            <wp:wrapNone/>
+            <wp:docPr id="1" name="" descr="" title=""/>
+            <wp:cNvGraphicFramePr>
+              <a:graphicFrameLocks xmlns:a="http://schemas.openxmlformats.org/drawingml/2006/main" noChangeAspect="1"/>
+            </wp:cNvGraphicFramePr>
+            <a:graphic xmlns:a="http://schemas.openxmlformats.org/drawingml/2006/main">
+              <a:graphicData uri="http://schemas.openxmlformats.org/drawingml/2006/picture">
+                <pic:pic xmlns:pic="http://schemas.openxmlformats.org/drawingml/2006/picture">
+                  <pic:nvPicPr>
+                    <pic:cNvPr id="0" name="" descr=""/>
+                    <pic:cNvPicPr>
+                      <a:picLocks noChangeAspect="1" noChangeArrowheads="1"/>
+                    </pic:cNvPicPr>
+                  </pic:nvPicPr>
+                  <pic:blipFill>
+                    <a:blip r:embed="rId17" cstate="none"/>
+                    <a:srcRect/>
+                    <a:stretch>
+                      <a:fillRect/>
+                    </a:stretch>
+                  </pic:blipFill>
+                  <pic:spPr bwMode="auto">
+                    <a:xfrm>
+                      <a:off x="0" y="0"/>
+                      <a:ext cx="609600" cy="695325"/>
+                    </a:xfrm>
+                    <a:prstGeom prst="rect">
+                      <a:avLst/>
+                    </a:prstGeom>
+                  </pic:spPr>
+                </pic:pic>
+              </a:graphicData>
+            </a:graphic>
+          </wp:anchor>
+        </w:drawing>
+      </w:r>
     </w:p>
     <w:p>
       <w:pPr>
@@ -39,7 +87,7 @@
           <w:sz w:val="19"/>
           <w:szCs w:val="19"/>
         </w:rPr>
-        <w:t xml:space="preserve">Rabat – Témara, Maroc</w:t>
+        <w:t xml:space="preserve">+212 644 972 403</w:t>
       </w:r>
       <w:r>
         <w:rPr>
@@ -48,21 +96,7 @@
         </w:rPr>
         <w:t xml:space="preserve">   ·   </w:t>
       </w:r>
-      <w:r>
-        <w:rPr>
-          <w:sz w:val="19"/>
-          <w:szCs w:val="19"/>
-        </w:rPr>
-        <w:t xml:space="preserve">+212 644 972 403</w:t>
-      </w:r>
-      <w:r>
-        <w:rPr>
-          <w:sz w:val="19"/>
-          <w:szCs w:val="19"/>
-        </w:rPr>
-        <w:t xml:space="preserve">   ·   </w:t>
-      </w:r>
-      <w:hyperlink w:history="1" r:id="rIdn-9rslmyfika1vgagbgat">
+      <w:hyperlink w:history="1" r:id="rIdiiikx-pctrmyec6uk17p1">
         <w:r>
           <w:rPr>
             <w:color w:val="000000"/>
@@ -84,7 +118,7 @@
         </w:rPr>
         <w:t xml:space="preserve">Portfolio : </w:t>
       </w:r>
-      <w:hyperlink w:history="1" r:id="rIdi-jhru7zrzvpicwppufuu">
+      <w:hyperlink w:history="1" r:id="rIdt26_hshr3gjnbzsm6wsst">
         <w:r>
           <w:rPr>
             <w:color w:val="000000"/>
@@ -108,7 +142,7 @@
         </w:rPr>
         <w:t xml:space="preserve">GitHub : </w:t>
       </w:r>
-      <w:hyperlink w:history="1" r:id="rIdfazbddq9y_89051vj1j44">
+      <w:hyperlink w:history="1" r:id="rIdpcfuf_8bmmlr9wi--fmnr">
         <w:r>
           <w:rPr>
             <w:color w:val="000000"/>
@@ -132,7 +166,7 @@
         </w:rPr>
         <w:t xml:space="preserve">LinkedIn : </w:t>
       </w:r>
-      <w:hyperlink w:history="1" r:id="rIdgul1595wmc77lma1zw7ku">
+      <w:hyperlink w:history="1" r:id="rIdpinhdoblidj3tkyoknyob">
         <w:r>
           <w:rPr>
             <w:color w:val="000000"/>
@@ -183,7 +217,7 @@
           <w:sz w:val="21"/>
           <w:szCs w:val="21"/>
         </w:rPr>
-        <w:t xml:space="preserve">FORMATION</w:t>
+        <w:t xml:space="preserve">FORMATIONS</w:t>
       </w:r>
     </w:p>
     <w:p>
@@ -260,7 +294,7 @@
           <w:sz w:val="21"/>
           <w:szCs w:val="21"/>
         </w:rPr>
-        <w:t xml:space="preserve">EXPÉRIENCE PROFESSIONNELLE</w:t>
+        <w:t xml:space="preserve">EXPÉRIENCES PROFESSIONNELLES</w:t>
       </w:r>
     </w:p>
     <w:p>
@@ -391,7 +425,7 @@
         <w:spacing w:after="0" w:before="20"/>
       </w:pPr>
       <w:r>
-        <w:t xml:space="preserve">Conteneurisé une application avec Docker en vue de son déploiement sur AWS.</w:t>
+        <w:t xml:space="preserve">Conteneurisé l'application (Docker) et automatisé le provisionnement avec Ansible pour un déploiement sur AWS.</w:t>
       </w:r>
     </w:p>
     <w:p>
@@ -404,7 +438,7 @@
         <w:spacing w:after="0" w:before="20"/>
       </w:pPr>
       <w:r>
-        <w:t xml:space="preserve">Déployé l'application sur Kubernetes avec AWS Fargate (serverless), selon les pratiques DevSecOps.</w:t>
+        <w:t xml:space="preserve">Déployé sur Kubernetes (AWS Fargate) via un pipeline CI/CD Jenkins, avec analyse de code SonarQube.</w:t>
       </w:r>
     </w:p>
     <w:p>
@@ -425,7 +459,7 @@
           <w:sz w:val="19"/>
           <w:szCs w:val="19"/>
         </w:rPr>
-        <w:t xml:space="preserve">Docker, Kubernetes, AWS Fargate</w:t>
+        <w:t xml:space="preserve">Docker, Kubernetes, AWS Fargate, Ansible, Jenkins, SonarQube</w:t>
       </w:r>
     </w:p>
     <w:p>
@@ -505,7 +539,7 @@
         <w:t xml:space="preserve">Laboratoire de simulation de phishing</w:t>
       </w:r>
       <w:r>
-        <w:t xml:space="preserve"> — Projet académique, 4ᵉ année · HTML, JavaScript, Docker</w:t>
+        <w:t xml:space="preserve"> — Projet académique, 4ᵉ année · GoPhish, Mailpit, Docker</w:t>
       </w:r>
       <w:r>
         <w:t xml:space="preserve">	</w:t>
@@ -528,7 +562,7 @@
         <w:spacing w:after="0" w:before="20"/>
       </w:pPr>
       <w:r>
-        <w:t xml:space="preserve">Conçu une page de connexion répliquée pour un exercice pédagogique autorisé de sensibilisation au phishing.</w:t>
+        <w:t xml:space="preserve">Conçu une page de connexion répliquée et une campagne de sensibilisation au phishing (exercice pédagogique autorisé).</w:t>
       </w:r>
     </w:p>
     <w:p>
@@ -558,7 +592,7 @@
         </w:tabs>
         <w:spacing w:after="20" w:before="0"/>
       </w:pPr>
-      <w:hyperlink w:history="1" r:id="rIdnamutuygdsvgi76iszgjb">
+      <w:hyperlink w:history="1" r:id="rIdfvauxz0dofqjvkobxddqb">
         <w:r>
           <w:rPr>
             <w:b/>
@@ -601,7 +635,7 @@
         </w:tabs>
         <w:spacing w:after="20" w:before="30"/>
       </w:pPr>
-      <w:hyperlink w:history="1" r:id="rIdz66p2blucy7hlggo2h-2g">
+      <w:hyperlink w:history="1" r:id="rIdyhgt9l7wfl_78pth0f5rf">
         <w:r>
           <w:rPr>
             <w:b/>
@@ -662,7 +696,7 @@
         </w:tabs>
         <w:spacing w:after="20" w:before="30"/>
       </w:pPr>
-      <w:hyperlink w:history="1" r:id="rId7-2hqzhbusxegc_ur3ms2">
+      <w:hyperlink w:history="1" r:id="rIdwde3vtplfxbpwusraicjo">
         <w:r>
           <w:rPr>
             <w:b/>
@@ -694,7 +728,7 @@
         </w:tabs>
         <w:spacing w:after="20" w:before="30"/>
       </w:pPr>
-      <w:hyperlink w:history="1" r:id="rIdmzgphfsnuproc_le2yim1">
+      <w:hyperlink w:history="1" r:id="rIdmvba1f2aqaqbw1vlryhpp">
         <w:r>
           <w:rPr>
             <w:b/>
@@ -726,7 +760,7 @@
         </w:tabs>
         <w:spacing w:after="20" w:before="30"/>
       </w:pPr>
-      <w:hyperlink w:history="1" r:id="rIdbxlnhy5wzgow2e9by79tn">
+      <w:hyperlink w:history="1" r:id="rIdlnus_4_5qiy-6sbp2q7zf">
         <w:r>
           <w:rPr>
             <w:b/>
@@ -777,7 +811,7 @@
         </w:tabs>
         <w:spacing w:after="20" w:before="0"/>
       </w:pPr>
-      <w:hyperlink w:history="1" r:id="rIdysz-bppts0ycg1ws5j_he">
+      <w:hyperlink w:history="1" r:id="rIdx9s34yulxtlupnlqf7jrf">
         <w:r>
           <w:rPr>
             <w:b/>
@@ -890,7 +924,7 @@
         <w:t xml:space="preserve">Analyse et automatisation : </w:t>
       </w:r>
       <w:r>
-        <w:t xml:space="preserve">Wireshark, XSStrike, DalFox, Playwright</w:t>
+        <w:t xml:space="preserve">XSStrike, DalFox, Playwright</w:t>
       </w:r>
     </w:p>
     <w:p>
@@ -910,7 +944,7 @@
         <w:t xml:space="preserve">Entraînement : </w:t>
       </w:r>
       <w:r>
-        <w:t xml:space="preserve">PortSwigger Web Security Academy (en cours)</w:t>
+        <w:t xml:space="preserve">TryHackMe, PortSwigger Web Security Academy (en cours)</w:t>
       </w:r>
     </w:p>
     <w:p>
@@ -930,7 +964,7 @@
         <w:t xml:space="preserve">Systèmes et supervision : </w:t>
       </w:r>
       <w:r>
-        <w:t xml:space="preserve">Kali Linux, Linux, Prometheus, Grafana, sécurité réseau, durcissement des systèmes</w:t>
+        <w:t xml:space="preserve">Kali Linux, Prometheus, Grafana, sécurité réseau (WireGuard, Wireshark), durcissement</w:t>
       </w:r>
     </w:p>
     <w:p>
@@ -950,7 +984,7 @@
         <w:t xml:space="preserve">Cloud et DevSecOps : </w:t>
       </w:r>
       <w:r>
-        <w:t xml:space="preserve">Docker, Kubernetes, AWS Fargate, GitHub Actions/GitLab CI, SonarQube, Git</w:t>
+        <w:t xml:space="preserve">Docker, Kubernetes, AWS Fargate, Ansible, Jenkins, SonarQube, GitLab/GitHub CI</w:t>
       </w:r>
     </w:p>
     <w:p>

</xml_diff>

<commit_message>
Add Cisco Ethical Hacker certificate to portfolio and CV
Completed 28 Oct 2026; shown in the portfolio gallery (now 23) and listed on
all CV versions as a completed course certificate (replacing the in-progress entry).

Co-Authored-By: Claude Opus 4.8 <noreply@anthropic.com>
</commit_message>
<xml_diff>
--- a/assets/cv/CV.docx
+++ b/assets/cv/CV.docx
@@ -42,7 +42,7 @@
                     </pic:cNvPicPr>
                   </pic:nvPicPr>
                   <pic:blipFill>
-                    <a:blip r:embed="rId17" cstate="none"/>
+                    <a:blip r:embed="rId18" cstate="none"/>
                     <a:srcRect/>
                     <a:stretch>
                       <a:fillRect/>
@@ -96,7 +96,7 @@
         </w:rPr>
         <w:t xml:space="preserve">   ·   </w:t>
       </w:r>
-      <w:hyperlink w:history="1" r:id="rIdiiikx-pctrmyec6uk17p1">
+      <w:hyperlink w:history="1" r:id="rIdwqymkqydwkcelt4npob9t">
         <w:r>
           <w:rPr>
             <w:color w:val="000000"/>
@@ -118,7 +118,7 @@
         </w:rPr>
         <w:t xml:space="preserve">Portfolio : </w:t>
       </w:r>
-      <w:hyperlink w:history="1" r:id="rIdt26_hshr3gjnbzsm6wsst">
+      <w:hyperlink w:history="1" r:id="rIdiw_aaloktjqjxfp42yfil">
         <w:r>
           <w:rPr>
             <w:color w:val="000000"/>
@@ -142,7 +142,7 @@
         </w:rPr>
         <w:t xml:space="preserve">GitHub : </w:t>
       </w:r>
-      <w:hyperlink w:history="1" r:id="rIdpcfuf_8bmmlr9wi--fmnr">
+      <w:hyperlink w:history="1" r:id="rId1rj8gd84gxtvomic7zjiv">
         <w:r>
           <w:rPr>
             <w:color w:val="000000"/>
@@ -166,7 +166,7 @@
         </w:rPr>
         <w:t xml:space="preserve">LinkedIn : </w:t>
       </w:r>
-      <w:hyperlink w:history="1" r:id="rIdpinhdoblidj3tkyoknyob">
+      <w:hyperlink w:history="1" r:id="rIdg3mob2iakrvd5rkawlikq">
         <w:r>
           <w:rPr>
             <w:color w:val="000000"/>
@@ -592,7 +592,7 @@
         </w:tabs>
         <w:spacing w:after="20" w:before="0"/>
       </w:pPr>
-      <w:hyperlink w:history="1" r:id="rIdfvauxz0dofqjvkobxddqb">
+      <w:hyperlink w:history="1" r:id="rIdxhguu_dbyuky4pkxg9kbq">
         <w:r>
           <w:rPr>
             <w:b/>
@@ -635,7 +635,39 @@
         </w:tabs>
         <w:spacing w:after="20" w:before="30"/>
       </w:pPr>
-      <w:hyperlink w:history="1" r:id="rIdyhgt9l7wfl_78pth0f5rf">
+      <w:hyperlink w:history="1" r:id="rIdhw9ipehxvn_itsyevk6x8">
+        <w:r>
+          <w:rPr>
+            <w:b/>
+            <w:bCs/>
+            <w:color w:val="000000"/>
+          </w:rPr>
+          <w:t xml:space="preserve">Ethical Hacker</w:t>
+        </w:r>
+      </w:hyperlink>
+      <w:r>
+        <w:t xml:space="preserve"> — Cisco Networking Academy · certificat de cours</w:t>
+      </w:r>
+      <w:r>
+        <w:t xml:space="preserve">	</w:t>
+      </w:r>
+      <w:r>
+        <w:rPr>
+          <w:sz w:val="19"/>
+          <w:szCs w:val="19"/>
+        </w:rPr>
+        <w:t xml:space="preserve">Octobre 2026</w:t>
+      </w:r>
+    </w:p>
+    <w:p>
+      <w:pPr>
+        <w:keepNext/>
+        <w:tabs>
+          <w:tab w:val="right" w:pos="10206"/>
+        </w:tabs>
+        <w:spacing w:after="20" w:before="30"/>
+      </w:pPr>
+      <w:hyperlink w:history="1" r:id="rIdmq6yawic4uy1l7rajvnt0">
         <w:r>
           <w:rPr>
             <w:b/>
@@ -667,36 +699,7 @@
         </w:tabs>
         <w:spacing w:after="20" w:before="30"/>
       </w:pPr>
-      <w:r>
-        <w:rPr>
-          <w:b/>
-          <w:bCs/>
-        </w:rPr>
-        <w:t xml:space="preserve">Ethical Hacker</w:t>
-      </w:r>
-      <w:r>
-        <w:t xml:space="preserve"> — Cisco Networking Academy · formation</w:t>
-      </w:r>
-      <w:r>
-        <w:t xml:space="preserve">	</w:t>
-      </w:r>
-      <w:r>
-        <w:rPr>
-          <w:sz w:val="19"/>
-          <w:szCs w:val="19"/>
-        </w:rPr>
-        <w:t xml:space="preserve">En cours</w:t>
-      </w:r>
-    </w:p>
-    <w:p>
-      <w:pPr>
-        <w:keepNext/>
-        <w:tabs>
-          <w:tab w:val="right" w:pos="10206"/>
-        </w:tabs>
-        <w:spacing w:after="20" w:before="30"/>
-      </w:pPr>
-      <w:hyperlink w:history="1" r:id="rIdwde3vtplfxbpwusraicjo">
+      <w:hyperlink w:history="1" r:id="rId3q12tlhim2d-zryrjanrp">
         <w:r>
           <w:rPr>
             <w:b/>
@@ -728,7 +731,7 @@
         </w:tabs>
         <w:spacing w:after="20" w:before="30"/>
       </w:pPr>
-      <w:hyperlink w:history="1" r:id="rIdmvba1f2aqaqbw1vlryhpp">
+      <w:hyperlink w:history="1" r:id="rIdcndmyv2xlar6v_arvjucu">
         <w:r>
           <w:rPr>
             <w:b/>
@@ -760,7 +763,7 @@
         </w:tabs>
         <w:spacing w:after="20" w:before="30"/>
       </w:pPr>
-      <w:hyperlink w:history="1" r:id="rIdlnus_4_5qiy-6sbp2q7zf">
+      <w:hyperlink w:history="1" r:id="rIdssj5kqhab_kxch588exxf">
         <w:r>
           <w:rPr>
             <w:b/>
@@ -811,7 +814,7 @@
         </w:tabs>
         <w:spacing w:after="20" w:before="0"/>
       </w:pPr>
-      <w:hyperlink w:history="1" r:id="rIdx9s34yulxtlupnlqf7jrf">
+      <w:hyperlink w:history="1" r:id="rIdar0ue5uggp3stwotmomru">
         <w:r>
           <w:rPr>
             <w:b/>

</xml_diff>